<commit_message>
Lead with AI/agent achievements; trim GEICO bullets to outcomes only.
- New top section "AI / Agent Engineering — Selected Work" placed before
  Work Experience, with achievement-first framing for each project:
  AI-assisted ops at GEICO, OpenClaw final paper, AgentOne runtime,
  LLM N-version programming, Gemini MCP/API bridge, applied AI study.
- GEICO role trimmed from a long list of implementation details to six
  outcome-style bullets (MCP-based AI ops, JFrog SaaS POC, Entra ID auth
  design, zero-impact Artifactory/X-Ray upgrades, Azure firewall unblock,
  NOCIM-11695 CoE + on-call).
- Removed the duplicate AI projects section that used to sit before
  Education; it has been merged with the new top section.

Co-authored-by: Cursor <cursoragent@cursor.com>
</commit_message>
<xml_diff>
--- a/Mingresume.docx
+++ b/Mingresume.docx
@@ -674,7 +674,7 @@
           <w:color w:val="1F3A68"/>
           <w:sz w:val="26"/>
         </w:rPr>
-        <w:t>WORK EXPERIENCE</w:t>
+        <w:t>AI / AGENT ENGINEERING — SELECTED WORK</w:t>
       </w:r>
     </w:p>
     <w:p>
@@ -688,56 +688,57 @@
           <w:color w:val="1F3A68"/>
           <w:sz w:val="23"/>
         </w:rPr>
-        <w:t>Senior Engineer — GEICO, Artifact Management Platform (Developer Engineering)</w:t>
-      </w:r>
-    </w:p>
-    <w:p>
-      <w:pPr>
-        <w:spacing w:after="40"/>
-      </w:pPr>
-      <w:r>
-        <w:rPr>
-          <w:b/>
-          <w:i/>
-          <w:sz w:val="20"/>
-        </w:rPr>
-        <w:t>Insurance · 06/2025 – Present</w:t>
-      </w:r>
-    </w:p>
-    <w:p>
-      <w:pPr>
-        <w:spacing w:after="40"/>
-      </w:pPr>
-      <w:r>
-        <w:rPr>
-          <w:i/>
-          <w:sz w:val="21"/>
-        </w:rPr>
-        <w:t>AI-assisted platform operations</w:t>
-      </w:r>
-    </w:p>
-    <w:p>
-      <w:pPr>
-        <w:pStyle w:val="ResumeBullets"/>
-        <w:spacing w:after="40"/>
-      </w:pPr>
-      <w:r>
-        <w:rPr>
-          <w:sz w:val="21"/>
-        </w:rPr>
-        <w:t>Integrated the JFrog MCP server into the team's developer environment and authored the AMP team's Slack MCP integration guidelines, giving coding agents safe, audited access to package-registry telemetry, runbooks, and support cases</w:t>
-      </w:r>
-    </w:p>
-    <w:p>
-      <w:pPr>
-        <w:pStyle w:val="ResumeBullets"/>
-        <w:spacing w:after="40"/>
-      </w:pPr>
-      <w:r>
-        <w:rPr>
-          <w:sz w:val="21"/>
-        </w:rPr>
-        <w:t>Adopted and contributed to internal Cursor / Claude "agent skills" for the team's support workflow (</w:t>
+        <w:t>AI-Assisted Platform Operations at GEICO (2025 – Present)</w:t>
+      </w:r>
+    </w:p>
+    <w:p>
+      <w:pPr>
+        <w:pStyle w:val="ResumeBullets"/>
+        <w:spacing w:after="40"/>
+      </w:pPr>
+      <w:r>
+        <w:rPr>
+          <w:sz w:val="21"/>
+        </w:rPr>
+        <w:t xml:space="preserve">Introduced </w:t>
+      </w:r>
+      <w:r>
+        <w:rPr>
+          <w:b/>
+          <w:sz w:val="21"/>
+        </w:rPr>
+        <w:t>MCP-based AI operations</w:t>
+      </w:r>
+      <w:r>
+        <w:rPr>
+          <w:sz w:val="21"/>
+        </w:rPr>
+        <w:t xml:space="preserve"> to the Artifact Management Platform team: integrated the JFrog MCP server and authored Slack MCP guidelines, giving coding agents safe access to registry telemetry, runbooks, and support cases</w:t>
+      </w:r>
+    </w:p>
+    <w:p>
+      <w:pPr>
+        <w:pStyle w:val="ResumeBullets"/>
+        <w:spacing w:after="40"/>
+      </w:pPr>
+      <w:r>
+        <w:rPr>
+          <w:sz w:val="21"/>
+        </w:rPr>
+        <w:t xml:space="preserve">Adopted and extended internal Cursor / Claude </w:t>
+      </w:r>
+      <w:r>
+        <w:rPr>
+          <w:b/>
+          <w:sz w:val="21"/>
+        </w:rPr>
+        <w:t>agent skills</w:t>
+      </w:r>
+      <w:r>
+        <w:rPr>
+          <w:sz w:val="21"/>
+        </w:rPr>
+        <w:t xml:space="preserve"> (</w:t>
       </w:r>
       <w:r>
         <w:rPr>
@@ -776,216 +777,32 @@
         <w:rPr>
           <w:sz w:val="21"/>
         </w:rPr>
-        <w:t>), shortening incident triage and runbook hygiene cycles and demonstrating how AI agents can run production-adjacent operations under guardrails</w:t>
-      </w:r>
-    </w:p>
-    <w:p>
-      <w:pPr>
-        <w:pStyle w:val="ResumeBullets"/>
-        <w:spacing w:after="40"/>
-      </w:pPr>
-      <w:r>
-        <w:rPr>
-          <w:sz w:val="21"/>
-        </w:rPr>
-        <w:t>Used AI agents to drive deeper root-cause analyses (e.g., the Azure Firewall TLS deep-packet-inspection issue below) and to draft RFCs, runbooks, and Correction-of-Errors documents</w:t>
-      </w:r>
-    </w:p>
-    <w:p>
-      <w:pPr>
-        <w:spacing w:after="40"/>
-      </w:pPr>
-      <w:r>
-        <w:rPr>
-          <w:i/>
-          <w:sz w:val="21"/>
-        </w:rPr>
-        <w:t>Platform engineering</w:t>
-      </w:r>
-    </w:p>
-    <w:p>
-      <w:pPr>
-        <w:pStyle w:val="ResumeBullets"/>
-        <w:spacing w:after="40"/>
-      </w:pPr>
-      <w:r>
-        <w:rPr>
-          <w:sz w:val="21"/>
-        </w:rPr>
-        <w:t>Senior engineer on the Artifact Management Platform (AMP) / Package Management team, operating the JFrog Artifactory HA, X-Ray, and JFrog Catalog stacks that serve as GEICO's enterprise package registry across non-prod and production on Azure Kubernetes Service (AKS)</w:t>
-      </w:r>
-    </w:p>
-    <w:p>
-      <w:pPr>
-        <w:pStyle w:val="ResumeBullets"/>
-        <w:spacing w:after="40"/>
-      </w:pPr>
-      <w:r>
-        <w:rPr>
-          <w:sz w:val="21"/>
-        </w:rPr>
-        <w:t>Drove rolling upgrades of Artifactory (7.111.12 → 7.125.11 → 7.146.8) and X-Ray (3.131.20 → 3.143.12) across the Package Registry and Martech tenants with documented runbooks and minimal customer impact</w:t>
-      </w:r>
-    </w:p>
-    <w:p>
-      <w:pPr>
-        <w:pStyle w:val="ResumeBullets"/>
-        <w:spacing w:after="40"/>
-      </w:pPr>
-      <w:r>
-        <w:rPr>
-          <w:sz w:val="21"/>
-        </w:rPr>
-        <w:t>Co-led the JFrog SaaS Proof of Concept (Phases 1–4): authored reusable GitHub Actions workflows to publish Python, Java, and Go artifacts to JFrog SaaS, defined publish/promotion patterns, and validated scale (5,000 repos / 5,000 mixed artifacts in parallel)</w:t>
-      </w:r>
-    </w:p>
-    <w:p>
-      <w:pPr>
-        <w:pStyle w:val="ResumeBullets"/>
-        <w:spacing w:after="40"/>
-      </w:pPr>
-      <w:r>
-        <w:rPr>
-          <w:sz w:val="21"/>
-        </w:rPr>
-        <w:t xml:space="preserve">Designed and authored the Entra ID (Azure AD) authentication RFC for the </w:t>
-      </w:r>
-      <w:r>
-        <w:rPr>
-          <w:rFonts w:ascii="Consolas" w:hAnsi="Consolas"/>
-          <w:sz w:val="21"/>
-        </w:rPr>
-        <w:t>amp-control-plane</w:t>
-      </w:r>
-      <w:r>
-        <w:rPr>
-          <w:sz w:val="21"/>
-        </w:rPr>
-        <w:t xml:space="preserve"> service, defining NP/PD access boundaries and bridging the platform with corporate SSO, ZTNA, and APISIX/APIM service-to-service auth standards</w:t>
-      </w:r>
-    </w:p>
-    <w:p>
-      <w:pPr>
-        <w:pStyle w:val="ResumeBullets"/>
-        <w:spacing w:after="40"/>
-      </w:pPr>
-      <w:r>
-        <w:rPr>
-          <w:sz w:val="21"/>
-        </w:rPr>
-        <w:t xml:space="preserve">Deployed </w:t>
-      </w:r>
-      <w:r>
-        <w:rPr>
-          <w:rFonts w:ascii="Consolas" w:hAnsi="Consolas"/>
-          <w:sz w:val="21"/>
-        </w:rPr>
-        <w:t>amp-control-plane</w:t>
-      </w:r>
-      <w:r>
-        <w:rPr>
-          <w:sz w:val="21"/>
-        </w:rPr>
-        <w:t xml:space="preserve"> to ACS production with HashiCorp Vault integration, PostgreSQL provisioning via internal "Club" blueprints, and CRQ-managed change control</w:t>
-      </w:r>
-    </w:p>
-    <w:p>
-      <w:pPr>
-        <w:pStyle w:val="ResumeBullets"/>
-        <w:spacing w:after="40"/>
-      </w:pPr>
-      <w:r>
-        <w:rPr>
-          <w:sz w:val="21"/>
-        </w:rPr>
-        <w:t>Diagnosed and resolved an Azure Firewall TLS deep-packet-inspection issue that was breaking S3-backed remote JFrog repositories (Debian, GitHub proxies); produced a packet-level root cause and drove the SSL inspection bypass through the network team</w:t>
-      </w:r>
-    </w:p>
-    <w:p>
-      <w:pPr>
-        <w:pStyle w:val="ResumeBullets"/>
-        <w:spacing w:after="40"/>
-      </w:pPr>
-      <w:r>
-        <w:rPr>
-          <w:sz w:val="21"/>
-        </w:rPr>
-        <w:t>Authored the post-incident Correction of Errors for NOCIM-11695 (Azure East US outage, April 2026) and owned on-call rotation for the AMP team</w:t>
-      </w:r>
-    </w:p>
-    <w:p>
-      <w:pPr>
-        <w:pStyle w:val="ResumeBullets"/>
-        <w:spacing w:after="40"/>
-      </w:pPr>
-      <w:r>
-        <w:rPr>
-          <w:sz w:val="21"/>
-        </w:rPr>
-        <w:t>Built GitHub Actions reusable templates for JFrog CLI install/auth, generic file uploads, Docker pull testing, and OIDC migration patterns for the SDK Pipelines team</w:t>
-      </w:r>
-    </w:p>
-    <w:p>
-      <w:pPr>
-        <w:pStyle w:val="ResumeBullets"/>
-        <w:spacing w:after="40"/>
-      </w:pPr>
-      <w:r>
-        <w:rPr>
-          <w:sz w:val="21"/>
-        </w:rPr>
-        <w:t>Wrote runbooks for AKS PDB-aware upgrades, Grafana dashboards, X-Ray persistent-volume fixes, JFrog Workers / Circle of Trust setup, and Artifactory release management</w:t>
-      </w:r>
-    </w:p>
-    <w:p>
-      <w:pPr>
-        <w:pStyle w:val="ResumeBullets"/>
-        <w:spacing w:after="40"/>
-      </w:pPr>
-      <w:r>
-        <w:rPr>
-          <w:sz w:val="21"/>
-        </w:rPr>
-        <w:t xml:space="preserve">Partnered with Identity, Database Platform, and SRE teams to rotate </w:t>
-      </w:r>
-      <w:r>
-        <w:rPr>
-          <w:rFonts w:ascii="Consolas" w:hAnsi="Consolas"/>
-          <w:sz w:val="21"/>
-        </w:rPr>
-        <w:t>SRV-JFROG-NP/PD</w:t>
-      </w:r>
-      <w:r>
-        <w:rPr>
-          <w:sz w:val="21"/>
-        </w:rPr>
-        <w:t xml:space="preserve"> service accounts, provision PostgreSQL roles, and drive the consolidation KPI across </w:t>
-      </w:r>
-      <w:r>
-        <w:rPr>
-          <w:rFonts w:ascii="Consolas" w:hAnsi="Consolas"/>
-          <w:sz w:val="21"/>
-        </w:rPr>
-        <w:t>packageregistry</w:t>
-      </w:r>
-      <w:r>
-        <w:rPr>
-          <w:sz w:val="21"/>
-        </w:rPr>
-        <w:t xml:space="preserve">, </w:t>
-      </w:r>
-      <w:r>
-        <w:rPr>
-          <w:rFonts w:ascii="Consolas" w:hAnsi="Consolas"/>
-          <w:sz w:val="21"/>
-        </w:rPr>
-        <w:t>artifactory-pd</w:t>
-      </w:r>
-      <w:r>
-        <w:rPr>
-          <w:sz w:val="21"/>
-        </w:rPr>
-        <w:t>, and Azure Container Registry</w:t>
+        <w:t>) for the team's support workflow — measurably shortening triage and improving runbook hygiene</w:t>
+      </w:r>
+    </w:p>
+    <w:p>
+      <w:pPr>
+        <w:pStyle w:val="ResumeBullets"/>
+        <w:spacing w:after="40"/>
+      </w:pPr>
+      <w:r>
+        <w:rPr>
+          <w:sz w:val="21"/>
+        </w:rPr>
+        <w:t xml:space="preserve">Routinely drive </w:t>
+      </w:r>
+      <w:r>
+        <w:rPr>
+          <w:b/>
+          <w:sz w:val="21"/>
+        </w:rPr>
+        <w:t>agent-assisted RCA, RFC, and CoE authoring</w:t>
+      </w:r>
+      <w:r>
+        <w:rPr>
+          <w:sz w:val="21"/>
+        </w:rPr>
+        <w:t xml:space="preserve"> for production incidents (e.g., the Azure Firewall TLS DPI investigation, NOCIM-11695 East US outage write-up)</w:t>
       </w:r>
     </w:p>
     <w:p>
@@ -999,92 +816,57 @@
           <w:color w:val="1F3A68"/>
           <w:sz w:val="23"/>
         </w:rPr>
-        <w:t>Staff Release Engineer / DevOps — Navan (formerly TripActions)</w:t>
-      </w:r>
-    </w:p>
-    <w:p>
-      <w:pPr>
-        <w:spacing w:after="40"/>
-      </w:pPr>
-      <w:r>
-        <w:rPr>
-          <w:b/>
+        <w:t>Cost-Aware Runtime for OpenClaw Browser Agents — IEEE-style Final Paper, Purdue ECE 50874/59500 (2026)</w:t>
+      </w:r>
+    </w:p>
+    <w:p>
+      <w:pPr>
+        <w:pStyle w:val="ResumeBullets"/>
+        <w:spacing w:after="40"/>
+      </w:pPr>
+      <w:r>
+        <w:rPr>
+          <w:sz w:val="21"/>
+        </w:rPr>
+        <w:t xml:space="preserve">Co-authored </w:t>
+      </w:r>
+      <w:r>
+        <w:rPr>
           <w:i/>
-          <w:sz w:val="20"/>
-        </w:rPr>
-        <w:t>E-Commerce · 01/2022 – 04/2025</w:t>
-      </w:r>
-    </w:p>
-    <w:p>
-      <w:pPr>
-        <w:pStyle w:val="ResumeBullets"/>
-        <w:spacing w:after="40"/>
-      </w:pPr>
-      <w:r>
-        <w:rPr>
-          <w:sz w:val="21"/>
-        </w:rPr>
-        <w:t>Led SOC 2 Type II audit remediation with security, compliance, and engineering teams; hardened build, release, and AWS infrastructure to support Navan's IPO and ongoing compliance</w:t>
-      </w:r>
-    </w:p>
-    <w:p>
-      <w:pPr>
-        <w:pStyle w:val="ResumeBullets"/>
-        <w:spacing w:after="40"/>
-      </w:pPr>
-      <w:r>
-        <w:rPr>
-          <w:sz w:val="21"/>
-        </w:rPr>
-        <w:t>Deployed and integrated HashiCorp Vault for centralized secrets management and SonarCloud for static code analysis and security scanning across CI/CD pipelines</w:t>
-      </w:r>
-    </w:p>
-    <w:p>
-      <w:pPr>
-        <w:pStyle w:val="ResumeBullets"/>
-        <w:spacing w:after="40"/>
-      </w:pPr>
-      <w:r>
-        <w:rPr>
-          <w:sz w:val="21"/>
-        </w:rPr>
-        <w:t>Built and maintained continuous delivery for the company's core web application and data systems on AWS</w:t>
-      </w:r>
-    </w:p>
-    <w:p>
-      <w:pPr>
-        <w:pStyle w:val="ResumeBullets"/>
-        <w:spacing w:after="40"/>
-      </w:pPr>
-      <w:r>
-        <w:rPr>
-          <w:sz w:val="21"/>
-        </w:rPr>
-        <w:t>Owned SCM and release engineering for the engineering organization; optimized release processes across AWS environments</w:t>
-      </w:r>
-    </w:p>
-    <w:p>
-      <w:pPr>
-        <w:pStyle w:val="ResumeBullets"/>
-        <w:spacing w:after="40"/>
-      </w:pPr>
-      <w:r>
-        <w:rPr>
-          <w:sz w:val="21"/>
-        </w:rPr>
-        <w:t>Built mobile CI/CD pipelines with Bitrise to automate App Store and Google Play deployments</w:t>
-      </w:r>
-    </w:p>
-    <w:p>
-      <w:pPr>
-        <w:pStyle w:val="ResumeBullets"/>
-        <w:spacing w:after="40"/>
-      </w:pPr>
-      <w:r>
-        <w:rPr>
-          <w:sz w:val="21"/>
-        </w:rPr>
-        <w:t>Responded rapidly to pipeline failures and production incidents; performed root-cause analysis and drove permanent fixes</w:t>
+          <w:sz w:val="21"/>
+        </w:rPr>
+        <w:t>"Design and Evaluation of a Cost-Aware Runtime for OpenClaw Browser Agents"</w:t>
+      </w:r>
+      <w:r>
+        <w:rPr>
+          <w:sz w:val="21"/>
+        </w:rPr>
+        <w:t xml:space="preserve"> with three Purdue ECE teammates</w:t>
+      </w:r>
+    </w:p>
+    <w:p>
+      <w:pPr>
+        <w:pStyle w:val="ResumeBullets"/>
+        <w:spacing w:after="40"/>
+      </w:pPr>
+      <w:r>
+        <w:rPr>
+          <w:sz w:val="21"/>
+        </w:rPr>
+        <w:t xml:space="preserve">Designed and evaluated a runtime that treats token cost, dollar spend, tool-call count, and wall-clock latency as </w:t>
+      </w:r>
+      <w:r>
+        <w:rPr>
+          <w:b/>
+          <w:sz w:val="21"/>
+        </w:rPr>
+        <w:t>first-class budgets</w:t>
+      </w:r>
+      <w:r>
+        <w:rPr>
+          <w:sz w:val="21"/>
+        </w:rPr>
+        <w:t>, with explicit termination policies (stop-and-summarize, ask-human, best-effort degrade)</w:t>
       </w:r>
     </w:p>
     <w:p>
@@ -1098,92 +880,57 @@
           <w:color w:val="1F3A68"/>
           <w:sz w:val="23"/>
         </w:rPr>
-        <w:t>Lead Release Engineer — Turn / Amobee</w:t>
-      </w:r>
-    </w:p>
-    <w:p>
-      <w:pPr>
-        <w:spacing w:after="40"/>
-      </w:pPr>
-      <w:r>
-        <w:rPr>
-          <w:b/>
-          <w:i/>
-          <w:sz w:val="20"/>
-        </w:rPr>
-        <w:t>Ad Technology · 12/2015 – 11/2021</w:t>
-      </w:r>
-    </w:p>
-    <w:p>
-      <w:pPr>
-        <w:pStyle w:val="ResumeBullets"/>
-        <w:spacing w:after="40"/>
-      </w:pPr>
-      <w:r>
-        <w:rPr>
-          <w:sz w:val="21"/>
-        </w:rPr>
-        <w:t>Led a team of 2 release engineers and 5 offshore NOC engineers, scaling release operations for a ~500-person engineering organization</w:t>
-      </w:r>
-    </w:p>
-    <w:p>
-      <w:pPr>
-        <w:pStyle w:val="ResumeBullets"/>
-        <w:spacing w:after="40"/>
-      </w:pPr>
-      <w:r>
-        <w:rPr>
-          <w:sz w:val="21"/>
-        </w:rPr>
-        <w:t>Redesigned and migrated Jenkins to a highly available, scalable architecture—reducing unplanned outages from hours per week to under 5 minutes of planned downtime per month, improving UI response from 12s to 0.5s per page, and saving $500K+/year vs. enterprise CloudBees licensing</w:t>
-      </w:r>
-    </w:p>
-    <w:p>
-      <w:pPr>
-        <w:pStyle w:val="ResumeBullets"/>
-        <w:spacing w:after="40"/>
-      </w:pPr>
-      <w:r>
-        <w:rPr>
-          <w:sz w:val="21"/>
-        </w:rPr>
-        <w:t>Redesigned and migrated Nexus with redundant HA architecture—eliminating unplanned outages post-migration and saving $100K+/year vs. enterprise Sonatype licensing</w:t>
-      </w:r>
-    </w:p>
-    <w:p>
-      <w:pPr>
-        <w:pStyle w:val="ResumeBullets"/>
-        <w:spacing w:after="40"/>
-      </w:pPr>
-      <w:r>
-        <w:rPr>
-          <w:sz w:val="21"/>
-        </w:rPr>
-        <w:t>Managed SCM and application deployments to thousands of production servers worldwide</w:t>
-      </w:r>
-    </w:p>
-    <w:p>
-      <w:pPr>
-        <w:pStyle w:val="ResumeBullets"/>
-        <w:spacing w:after="40"/>
-      </w:pPr>
-      <w:r>
-        <w:rPr>
-          <w:sz w:val="21"/>
-        </w:rPr>
-        <w:t>Built tools and automation to enable rapid, reliable deployment across production environments</w:t>
-      </w:r>
-    </w:p>
-    <w:p>
-      <w:pPr>
-        <w:pStyle w:val="ResumeBullets"/>
-        <w:spacing w:after="40"/>
-      </w:pPr>
-      <w:r>
-        <w:rPr>
-          <w:sz w:val="21"/>
-        </w:rPr>
-        <w:t>Enforced and improved release processes; served in a hands-on Technical Operations role for production systems</w:t>
+        <w:t>AgentOne — Cost / Latency / Reliability-Aware Agent Runtime (2026)</w:t>
+      </w:r>
+    </w:p>
+    <w:p>
+      <w:pPr>
+        <w:pStyle w:val="ResumeBullets"/>
+        <w:spacing w:after="40"/>
+      </w:pPr>
+      <w:r>
+        <w:rPr>
+          <w:sz w:val="21"/>
+        </w:rPr>
+        <w:t xml:space="preserve">Architected an agent runtime exposing a REST API + CLI, a planning/execution loop over repo / API / document tools, and </w:t>
+      </w:r>
+      <w:r>
+        <w:rPr>
+          <w:b/>
+          <w:sz w:val="21"/>
+        </w:rPr>
+        <w:t>continuous enforcement of token, dollar, tool-call, retry, and wall-clock budgets</w:t>
+      </w:r>
+      <w:r>
+        <w:rPr>
+          <w:sz w:val="21"/>
+        </w:rPr>
+        <w:t xml:space="preserve"> with budget-aware prompting and graceful degradation</w:t>
+      </w:r>
+    </w:p>
+    <w:p>
+      <w:pPr>
+        <w:pStyle w:val="ResumeBullets"/>
+        <w:spacing w:after="40"/>
+      </w:pPr>
+      <w:r>
+        <w:rPr>
+          <w:sz w:val="21"/>
+        </w:rPr>
+        <w:t xml:space="preserve">Routed across </w:t>
+      </w:r>
+      <w:r>
+        <w:rPr>
+          <w:b/>
+          <w:sz w:val="21"/>
+        </w:rPr>
+        <w:t>local backends (Ollama, vLLM) and a remote gateway</w:t>
+      </w:r>
+      <w:r>
+        <w:rPr>
+          <w:sz w:val="21"/>
+        </w:rPr>
+        <w:t>; specified structured per-run telemetry (cost breakdown, token counts, retry paths, latency distribution) and a benchmark suite (CI triage, dependency-bump, breaking-change summarization) — [github.com/mailming/AgentOne](https://github.com/mailming/AgentOne)</w:t>
       </w:r>
     </w:p>
     <w:p>
@@ -1197,68 +944,70 @@
           <w:color w:val="1F3A68"/>
           <w:sz w:val="23"/>
         </w:rPr>
-        <w:t>Sr. Software Engineer — Skytree</w:t>
-      </w:r>
-    </w:p>
-    <w:p>
-      <w:pPr>
-        <w:spacing w:after="40"/>
-      </w:pPr>
-      <w:r>
-        <w:rPr>
-          <w:b/>
-          <w:i/>
-          <w:sz w:val="20"/>
-        </w:rPr>
-        <w:t>Machine Learning · 04/2014 – 11/2015</w:t>
-      </w:r>
-    </w:p>
-    <w:p>
-      <w:pPr>
-        <w:pStyle w:val="ResumeBullets"/>
-        <w:spacing w:after="40"/>
-      </w:pPr>
-      <w:r>
-        <w:rPr>
-          <w:sz w:val="21"/>
-        </w:rPr>
-        <w:t>Designed and implemented end-to-end Continuous Integration and Continuous Delivery systems</w:t>
-      </w:r>
-    </w:p>
-    <w:p>
-      <w:pPr>
-        <w:pStyle w:val="ResumeBullets"/>
-        <w:spacing w:after="40"/>
-      </w:pPr>
-      <w:r>
-        <w:rPr>
-          <w:sz w:val="21"/>
-        </w:rPr>
-        <w:t>Built automation tools to accelerate the development lifecycle and dynamic cluster provisioning on AWS (EC2, S3, EMR)</w:t>
-      </w:r>
-    </w:p>
-    <w:p>
-      <w:pPr>
-        <w:pStyle w:val="ResumeBullets"/>
-        <w:spacing w:after="40"/>
-      </w:pPr>
-      <w:r>
-        <w:rPr>
-          <w:sz w:val="21"/>
-        </w:rPr>
-        <w:t>Designed and implemented a PaaS tool for on-demand environment provisioning</w:t>
-      </w:r>
-    </w:p>
-    <w:p>
-      <w:pPr>
-        <w:pStyle w:val="ResumeBullets"/>
-        <w:spacing w:after="40"/>
-      </w:pPr>
-      <w:r>
-        <w:rPr>
-          <w:sz w:val="21"/>
-        </w:rPr>
-        <w:t>Introduced Scrum and led the development team through agile adoption using Jira</w:t>
+        <w:t>LLM-Powered N-Version Programming — Purdue ECE 50874 Lab 2 (2026)</w:t>
+      </w:r>
+    </w:p>
+    <w:p>
+      <w:pPr>
+        <w:pStyle w:val="ResumeBullets"/>
+        <w:spacing w:after="40"/>
+      </w:pPr>
+      <w:r>
+        <w:rPr>
+          <w:sz w:val="21"/>
+        </w:rPr>
+        <w:t xml:space="preserve">Generated </w:t>
+      </w:r>
+      <w:r>
+        <w:rPr>
+          <w:b/>
+          <w:sz w:val="21"/>
+        </w:rPr>
+        <w:t>three independent implementations (Python, Go, C++)</w:t>
+      </w:r>
+      <w:r>
+        <w:rPr>
+          <w:sz w:val="21"/>
+        </w:rPr>
+        <w:t xml:space="preserve"> of an Avalon tax-code engine using three different LLMs, ran </w:t>
+      </w:r>
+      <w:r>
+        <w:rPr>
+          <w:b/>
+          <w:sz w:val="21"/>
+        </w:rPr>
+        <w:t>10,000 reserved test cases</w:t>
+      </w:r>
+      <w:r>
+        <w:rPr>
+          <w:sz w:val="21"/>
+        </w:rPr>
+        <w:t>, and built a 2-out-of-3 agreement table to quantify LLM-to-LLM divergence</w:t>
+      </w:r>
+    </w:p>
+    <w:p>
+      <w:pPr>
+        <w:pStyle w:val="ResumeBullets"/>
+        <w:spacing w:after="40"/>
+      </w:pPr>
+      <w:r>
+        <w:rPr>
+          <w:sz w:val="21"/>
+        </w:rPr>
+        <w:t xml:space="preserve">Authored the diversity strategy and the analysis of where versions disagreed (floating-point, rounding, threshold, FIFO ordering); wrote up the 2oo3 reliability math </w:t>
+      </w:r>
+      <w:r>
+        <w:rPr>
+          <w:rFonts w:ascii="Consolas" w:hAnsi="Consolas"/>
+          <w:sz w:val="21"/>
+        </w:rPr>
+        <w:t>P(failure) = p²(3 − 2p)</w:t>
+      </w:r>
+      <w:r>
+        <w:rPr>
+          <w:sz w:val="21"/>
+        </w:rPr>
+        <w:t xml:space="preserve"> — [github.com/mailming/purdueECE874-Lab2](https://github.com/mailming/purdueECE874-Lab2)</w:t>
       </w:r>
     </w:p>
     <w:p>
@@ -1272,56 +1021,32 @@
           <w:color w:val="1F3A68"/>
           <w:sz w:val="23"/>
         </w:rPr>
-        <w:t>Sr. Software Engineer — Walmart Labs</w:t>
-      </w:r>
-    </w:p>
-    <w:p>
-      <w:pPr>
-        <w:spacing w:after="40"/>
-      </w:pPr>
-      <w:r>
-        <w:rPr>
-          <w:b/>
-          <w:i/>
-          <w:sz w:val="20"/>
-        </w:rPr>
-        <w:t>E-Commerce · 03/2013 – 04/2014</w:t>
-      </w:r>
-    </w:p>
-    <w:p>
-      <w:pPr>
-        <w:pStyle w:val="ResumeBullets"/>
-        <w:spacing w:after="40"/>
-      </w:pPr>
-      <w:r>
-        <w:rPr>
-          <w:sz w:val="21"/>
-        </w:rPr>
-        <w:t>Built, released, and automated deployments into Dev, QA, and internal production environments</w:t>
-      </w:r>
-    </w:p>
-    <w:p>
-      <w:pPr>
-        <w:pStyle w:val="ResumeBullets"/>
-        <w:spacing w:after="40"/>
-      </w:pPr>
-      <w:r>
-        <w:rPr>
-          <w:sz w:val="21"/>
-        </w:rPr>
-        <w:t>Operated, monitored, and administered multiple production systems and internal tools</w:t>
-      </w:r>
-    </w:p>
-    <w:p>
-      <w:pPr>
-        <w:pStyle w:val="ResumeBullets"/>
-        <w:spacing w:after="40"/>
-      </w:pPr>
-      <w:r>
-        <w:rPr>
-          <w:sz w:val="21"/>
-        </w:rPr>
-        <w:t>Provided build, release, and infrastructure support across engineering teams in an agile environment</w:t>
+        <w:t>Gemini Chat MCP / API Bridge (2025)</w:t>
+      </w:r>
+    </w:p>
+    <w:p>
+      <w:pPr>
+        <w:pStyle w:val="ResumeBullets"/>
+        <w:spacing w:after="40"/>
+      </w:pPr>
+      <w:r>
+        <w:rPr>
+          <w:sz w:val="21"/>
+        </w:rPr>
+        <w:t xml:space="preserve">Built and shipped a </w:t>
+      </w:r>
+      <w:r>
+        <w:rPr>
+          <w:b/>
+          <w:sz w:val="21"/>
+        </w:rPr>
+        <w:t>Flask + WebSocket + Tampermonkey + Playwright</w:t>
+      </w:r>
+      <w:r>
+        <w:rPr>
+          <w:sz w:val="21"/>
+        </w:rPr>
+        <w:t xml:space="preserve"> bridge that exposes the Gemini chat web UI as a Gemini-API-compatible HTTP endpoint and an MCP server, enabling programmatic LLM access without paid API quota — [github.com/mailming/gemini-chat-userscript](https://github.com/mailming/gemini-chat-userscript)</w:t>
       </w:r>
     </w:p>
     <w:p>
@@ -1335,265 +1060,97 @@
           <w:color w:val="1F3A68"/>
           <w:sz w:val="23"/>
         </w:rPr>
-        <w:t>Software Engineer — Macrovision / Rovi</w:t>
-      </w:r>
-    </w:p>
-    <w:p>
-      <w:pPr>
-        <w:spacing w:after="40"/>
-      </w:pPr>
-      <w:r>
-        <w:rPr>
-          <w:b/>
-          <w:i/>
-          <w:sz w:val="20"/>
-        </w:rPr>
-        <w:t>Digital Media · 11/2009 – 02/2013</w:t>
-      </w:r>
-    </w:p>
-    <w:p>
-      <w:pPr>
-        <w:pStyle w:val="ResumeBullets"/>
-        <w:spacing w:after="40"/>
-      </w:pPr>
-      <w:r>
-        <w:rPr>
-          <w:sz w:val="21"/>
-        </w:rPr>
-        <w:t>Defined and maintained configuration management, build/release, and change management across 20+ projects with four domestic and international teams</w:t>
-      </w:r>
-    </w:p>
-    <w:p>
-      <w:pPr>
-        <w:pStyle w:val="ResumeBullets"/>
-        <w:spacing w:after="40"/>
-      </w:pPr>
-      <w:r>
-        <w:rPr>
-          <w:sz w:val="21"/>
-        </w:rPr>
-        <w:t>Led server layout design and deployment procedures for server, web, and mobile applications</w:t>
-      </w:r>
-    </w:p>
-    <w:p>
-      <w:pPr>
-        <w:pStyle w:val="ResumeBullets"/>
-        <w:spacing w:after="40"/>
-      </w:pPr>
-      <w:r>
-        <w:rPr>
-          <w:sz w:val="21"/>
-        </w:rPr>
-        <w:t>Supported Hadoop, MapReduce, and MongoDB system setup and operations</w:t>
-      </w:r>
-    </w:p>
-    <w:p>
-      <w:pPr>
-        <w:pStyle w:val="ResumeBullets"/>
-        <w:spacing w:after="40"/>
-      </w:pPr>
-      <w:r>
-        <w:rPr>
-          <w:sz w:val="21"/>
-        </w:rPr>
-        <w:t>Automated builds (Maven, Ant, xcodebuild, MSBuild) and CI pipelines (TeamCity, Jenkins)</w:t>
-      </w:r>
-    </w:p>
-    <w:p>
-      <w:pPr>
-        <w:pStyle w:val="ResumeBullets"/>
-        <w:spacing w:after="40"/>
-      </w:pPr>
-      <w:r>
-        <w:rPr>
-          <w:sz w:val="21"/>
-        </w:rPr>
-        <w:t>Built a configuration management portal with source archives, build metadata, and automated release notes</w:t>
-      </w:r>
-    </w:p>
-    <w:p>
-      <w:pPr>
-        <w:pStyle w:val="ResumeBullets"/>
-        <w:spacing w:after="40"/>
-      </w:pPr>
-      <w:r>
-        <w:rPr>
-          <w:sz w:val="21"/>
-        </w:rPr>
-        <w:t>Automated Tomcat deployments via Shell scripting; developed Python system tools and RPM-based installations</w:t>
-      </w:r>
-    </w:p>
-    <w:p>
-      <w:pPr>
-        <w:pStyle w:val="ResumeBullets"/>
-        <w:spacing w:after="40"/>
-      </w:pPr>
-      <w:r>
-        <w:rPr>
-          <w:sz w:val="21"/>
-        </w:rPr>
-        <w:t>Established and maintained company Git repositories</w:t>
-      </w:r>
-    </w:p>
-    <w:p>
-      <w:pPr>
-        <w:pStyle w:val="ResumeHeader"/>
-        <w:spacing w:before="160" w:after="0"/>
-      </w:pPr>
-      <w:r>
-        <w:rPr>
-          <w:b/>
-          <w:color w:val="1F3A68"/>
-          <w:sz w:val="23"/>
-        </w:rPr>
-        <w:t>SCM Manager — Helio / Virgin Mobile USA / Sprint</w:t>
-      </w:r>
-    </w:p>
-    <w:p>
-      <w:pPr>
-        <w:spacing w:after="40"/>
-      </w:pPr>
-      <w:r>
-        <w:rPr>
-          <w:b/>
-          <w:i/>
-          <w:sz w:val="20"/>
-        </w:rPr>
-        <w:t>Telecommunications · 02/2007 – 10/2009</w:t>
-      </w:r>
-    </w:p>
-    <w:p>
-      <w:pPr>
-        <w:pStyle w:val="ResumeBullets"/>
-        <w:spacing w:after="40"/>
-      </w:pPr>
-      <w:r>
-        <w:rPr>
-          <w:sz w:val="21"/>
-        </w:rPr>
-        <w:t>Led server layout design and deployment procedures across multiple product lines</w:t>
-      </w:r>
-    </w:p>
-    <w:p>
-      <w:pPr>
-        <w:pStyle w:val="ResumeBullets"/>
-        <w:spacing w:after="40"/>
-      </w:pPr>
-      <w:r>
-        <w:rPr>
-          <w:sz w:val="21"/>
-        </w:rPr>
-        <w:t>Administered a 10+ server Linux dev lab; implemented VM automation via Kickstart</w:t>
-      </w:r>
-    </w:p>
-    <w:p>
-      <w:pPr>
-        <w:pStyle w:val="ResumeBullets"/>
-        <w:spacing w:after="40"/>
-      </w:pPr>
-      <w:r>
-        <w:rPr>
-          <w:sz w:val="21"/>
-        </w:rPr>
-        <w:t>Built CI pipelines with CruiseControl and Hudson/Jenkins; automated JBoss deployments with Shell, Perl, and Python</w:t>
-      </w:r>
-    </w:p>
-    <w:p>
-      <w:pPr>
-        <w:pStyle w:val="ResumeBullets"/>
-        <w:spacing w:after="40"/>
-      </w:pPr>
-      <w:r>
-        <w:rPr>
-          <w:sz w:val="21"/>
-        </w:rPr>
-        <w:t>Evaluated and deployed defect tracking systems (Jira, Trac, Bugzilla, Mantis); implemented Trac and Bugzilla for dev and QA</w:t>
-      </w:r>
-    </w:p>
-    <w:p>
-      <w:pPr>
-        <w:pStyle w:val="ResumeBullets"/>
-        <w:spacing w:after="40"/>
-      </w:pPr>
-      <w:r>
-        <w:rPr>
-          <w:sz w:val="21"/>
-        </w:rPr>
-        <w:t>Created a configuration management portal and continuous deployment workflows using ControlTier</w:t>
-      </w:r>
-    </w:p>
-    <w:p>
-      <w:pPr>
-        <w:pStyle w:val="ResumeHeader"/>
-        <w:spacing w:before="160" w:after="0"/>
-      </w:pPr>
-      <w:r>
-        <w:rPr>
-          <w:b/>
-          <w:color w:val="1F3A68"/>
-          <w:sz w:val="23"/>
-        </w:rPr>
-        <w:t>Software Developer — XLDynamics</w:t>
-      </w:r>
-    </w:p>
-    <w:p>
-      <w:pPr>
-        <w:spacing w:after="40"/>
-      </w:pPr>
-      <w:r>
-        <w:rPr>
-          <w:b/>
-          <w:sz w:val="21"/>
-        </w:rPr>
-        <w:t>01/2005 – 02/2007</w:t>
-      </w:r>
-    </w:p>
-    <w:p>
-      <w:pPr>
-        <w:pStyle w:val="ResumeBullets"/>
-        <w:spacing w:after="40"/>
-      </w:pPr>
-      <w:r>
-        <w:rPr>
-          <w:sz w:val="21"/>
-        </w:rPr>
-        <w:t>Built and configured core development systems across Linux, Unix, and Windows</w:t>
-      </w:r>
-    </w:p>
-    <w:p>
-      <w:pPr>
-        <w:pStyle w:val="ResumeBullets"/>
-        <w:spacing w:after="40"/>
-      </w:pPr>
-      <w:r>
-        <w:rPr>
-          <w:sz w:val="21"/>
-        </w:rPr>
-        <w:t>Created Shell scripts to monitor, test, and install software on Linux servers</w:t>
-      </w:r>
-    </w:p>
-    <w:p>
-      <w:pPr>
-        <w:pStyle w:val="ResumeBullets"/>
-        <w:spacing w:after="40"/>
-      </w:pPr>
-      <w:r>
-        <w:rPr>
-          <w:sz w:val="21"/>
-        </w:rPr>
-        <w:t>Developed C++ XML/SOAP applications and HTML/JavaScript web interfaces</w:t>
-      </w:r>
-    </w:p>
-    <w:p>
-      <w:pPr>
-        <w:pStyle w:val="ResumeBullets"/>
-        <w:spacing w:after="40"/>
-      </w:pPr>
-      <w:r>
-        <w:rPr>
-          <w:sz w:val="21"/>
-        </w:rPr>
-        <w:t>Resolved build and release issues and tracked software changes across multiple projects</w:t>
+        <w:t>Applied AI / Agent Study</w:t>
+      </w:r>
+    </w:p>
+    <w:p>
+      <w:pPr>
+        <w:pStyle w:val="ResumeBullets"/>
+        <w:spacing w:after="40"/>
+      </w:pPr>
+      <w:r>
+        <w:rPr>
+          <w:sz w:val="21"/>
+        </w:rPr>
+        <w:t xml:space="preserve">Active contributor and reader across the agent / LLM-ops ecosystem: </w:t>
+      </w:r>
+      <w:r>
+        <w:rPr>
+          <w:rFonts w:ascii="Consolas" w:hAnsi="Consolas"/>
+          <w:sz w:val="21"/>
+        </w:rPr>
+        <w:t>langfuse</w:t>
+      </w:r>
+      <w:r>
+        <w:rPr>
+          <w:sz w:val="21"/>
+        </w:rPr>
+        <w:t xml:space="preserve"> (LLM observability), </w:t>
+      </w:r>
+      <w:r>
+        <w:rPr>
+          <w:rFonts w:ascii="Consolas" w:hAnsi="Consolas"/>
+          <w:sz w:val="21"/>
+        </w:rPr>
+        <w:t>agentops</w:t>
+      </w:r>
+      <w:r>
+        <w:rPr>
+          <w:sz w:val="21"/>
+        </w:rPr>
+        <w:t xml:space="preserve"> (agent monitoring), Browser-MCP, </w:t>
+      </w:r>
+      <w:r>
+        <w:rPr>
+          <w:rFonts w:ascii="Consolas" w:hAnsi="Consolas"/>
+          <w:sz w:val="21"/>
+        </w:rPr>
+        <w:t>openclaw</w:t>
+      </w:r>
+      <w:r>
+        <w:rPr>
+          <w:sz w:val="21"/>
+        </w:rPr>
+        <w:t xml:space="preserve">, </w:t>
+      </w:r>
+      <w:r>
+        <w:rPr>
+          <w:rFonts w:ascii="Consolas" w:hAnsi="Consolas"/>
+          <w:sz w:val="21"/>
+        </w:rPr>
+        <w:t>minimind</w:t>
+      </w:r>
+      <w:r>
+        <w:rPr>
+          <w:sz w:val="21"/>
+        </w:rPr>
+        <w:t xml:space="preserve"> (training a 26M-parameter GPT from scratch), Anthropic's prompt-engineering tutorial, and multi-agent finance projects (</w:t>
+      </w:r>
+      <w:r>
+        <w:rPr>
+          <w:rFonts w:ascii="Consolas" w:hAnsi="Consolas"/>
+          <w:sz w:val="21"/>
+        </w:rPr>
+        <w:t>TradingAgents</w:t>
+      </w:r>
+      <w:r>
+        <w:rPr>
+          <w:sz w:val="21"/>
+        </w:rPr>
+        <w:t xml:space="preserve">, </w:t>
+      </w:r>
+      <w:r>
+        <w:rPr>
+          <w:rFonts w:ascii="Consolas" w:hAnsi="Consolas"/>
+          <w:sz w:val="21"/>
+        </w:rPr>
+        <w:t>ai-hedge-fund</w:t>
+      </w:r>
+      <w:r>
+        <w:rPr>
+          <w:sz w:val="21"/>
+        </w:rPr>
+        <w:t>)</w:t>
       </w:r>
     </w:p>
     <w:p>
@@ -1615,7 +1172,7 @@
           <w:color w:val="1F3A68"/>
           <w:sz w:val="26"/>
         </w:rPr>
-        <w:t>SELECTED AI / AGENT PROJECTS</w:t>
+        <w:t>WORK EXPERIENCE</w:t>
       </w:r>
     </w:p>
     <w:p>
@@ -1629,44 +1186,160 @@
           <w:color w:val="1F3A68"/>
           <w:sz w:val="23"/>
         </w:rPr>
-        <w:t>Cost-Aware Runtime for OpenClaw Browser Agents — Purdue ECE 50874/59500, Team Final Project (2026)</w:t>
-      </w:r>
-    </w:p>
-    <w:p>
-      <w:pPr>
-        <w:pStyle w:val="ResumeBullets"/>
-        <w:spacing w:after="40"/>
-      </w:pPr>
-      <w:r>
-        <w:rPr>
-          <w:sz w:val="21"/>
-        </w:rPr>
-        <w:t xml:space="preserve">Co-authored an IEEE-style final paper, </w:t>
-      </w:r>
-      <w:r>
-        <w:rPr>
+        <w:t>Senior Engineer — GEICO, Artifact Management Platform (Developer Engineering)</w:t>
+      </w:r>
+    </w:p>
+    <w:p>
+      <w:pPr>
+        <w:spacing w:after="40"/>
+      </w:pPr>
+      <w:r>
+        <w:rPr>
+          <w:b/>
           <w:i/>
-          <w:sz w:val="21"/>
-        </w:rPr>
-        <w:t>"Design and Evaluation of a Cost-Aware Runtime for OpenClaw Browser Agents"</w:t>
-      </w:r>
-      <w:r>
-        <w:rPr>
-          <w:sz w:val="21"/>
-        </w:rPr>
-        <w:t>, with three Purdue ECE teammates</w:t>
-      </w:r>
-    </w:p>
-    <w:p>
-      <w:pPr>
-        <w:pStyle w:val="ResumeBullets"/>
-        <w:spacing w:after="40"/>
-      </w:pPr>
-      <w:r>
-        <w:rPr>
-          <w:sz w:val="21"/>
-        </w:rPr>
-        <w:t>Contributed to the runtime design that treats token cost, dollar spend, tool-call count, and wall-clock latency as first-class budgets and applies explicit termination policies (stop-and-summarize, ask-human, best-effort degrade) when budgets are exhausted</w:t>
+          <w:sz w:val="20"/>
+        </w:rPr>
+        <w:t>Insurance · 06/2025 – Present</w:t>
+      </w:r>
+    </w:p>
+    <w:p>
+      <w:pPr>
+        <w:pStyle w:val="ResumeBullets"/>
+        <w:spacing w:after="40"/>
+      </w:pPr>
+      <w:r>
+        <w:rPr>
+          <w:b/>
+          <w:sz w:val="21"/>
+        </w:rPr>
+        <w:t>Pioneered MCP-based AI-assisted operations</w:t>
+      </w:r>
+      <w:r>
+        <w:rPr>
+          <w:sz w:val="21"/>
+        </w:rPr>
+        <w:t xml:space="preserve"> on the AMP team (see </w:t>
+      </w:r>
+      <w:r>
+        <w:rPr>
+          <w:i/>
+          <w:sz w:val="21"/>
+        </w:rPr>
+        <w:t>AI / Agent Engineering — Selected Work</w:t>
+      </w:r>
+      <w:r>
+        <w:rPr>
+          <w:sz w:val="21"/>
+        </w:rPr>
+        <w:t xml:space="preserve"> above)</w:t>
+      </w:r>
+    </w:p>
+    <w:p>
+      <w:pPr>
+        <w:pStyle w:val="ResumeBullets"/>
+        <w:spacing w:after="40"/>
+      </w:pPr>
+      <w:r>
+        <w:rPr>
+          <w:b/>
+          <w:sz w:val="21"/>
+        </w:rPr>
+        <w:t>Co-led the JFrog SaaS POC</w:t>
+      </w:r>
+      <w:r>
+        <w:rPr>
+          <w:sz w:val="21"/>
+        </w:rPr>
+        <w:t xml:space="preserve"> through Phase 4 — proved Python/Java/Go publishing pipelines and validated scale at 5,000 repos / 5,000 mixed artifacts in parallel</w:t>
+      </w:r>
+    </w:p>
+    <w:p>
+      <w:pPr>
+        <w:pStyle w:val="ResumeBullets"/>
+        <w:spacing w:after="40"/>
+      </w:pPr>
+      <w:r>
+        <w:rPr>
+          <w:b/>
+          <w:sz w:val="21"/>
+        </w:rPr>
+        <w:t>Owned the Entra ID auth design</w:t>
+      </w:r>
+      <w:r>
+        <w:rPr>
+          <w:sz w:val="21"/>
+        </w:rPr>
+        <w:t xml:space="preserve"> for the </w:t>
+      </w:r>
+      <w:r>
+        <w:rPr>
+          <w:rFonts w:ascii="Consolas" w:hAnsi="Consolas"/>
+          <w:sz w:val="21"/>
+        </w:rPr>
+        <w:t>amp-control-plane</w:t>
+      </w:r>
+      <w:r>
+        <w:rPr>
+          <w:sz w:val="21"/>
+        </w:rPr>
+        <w:t xml:space="preserve"> service, separating NP/PD access boundaries and aligning the platform with corporate SSO and service-to-service auth standards</w:t>
+      </w:r>
+    </w:p>
+    <w:p>
+      <w:pPr>
+        <w:pStyle w:val="ResumeBullets"/>
+        <w:spacing w:after="40"/>
+      </w:pPr>
+      <w:r>
+        <w:rPr>
+          <w:b/>
+          <w:sz w:val="21"/>
+        </w:rPr>
+        <w:t>Delivered zero-customer-impact upgrades</w:t>
+      </w:r>
+      <w:r>
+        <w:rPr>
+          <w:sz w:val="21"/>
+        </w:rPr>
+        <w:t xml:space="preserve"> of Artifactory (7.111.12 → 7.146.8) and X-Ray (3.131.20 → 3.143.12) across Package Registry and Martech tenants on AKS</w:t>
+      </w:r>
+    </w:p>
+    <w:p>
+      <w:pPr>
+        <w:pStyle w:val="ResumeBullets"/>
+        <w:spacing w:after="40"/>
+      </w:pPr>
+      <w:r>
+        <w:rPr>
+          <w:b/>
+          <w:sz w:val="21"/>
+        </w:rPr>
+        <w:t>Unblocked enterprise package proxies</w:t>
+      </w:r>
+      <w:r>
+        <w:rPr>
+          <w:sz w:val="21"/>
+        </w:rPr>
+        <w:t xml:space="preserve"> by root-causing an Azure Firewall TLS deep-packet-inspection issue against S3-backed remotes (Debian, GitHub) and driving the inspection bypass through the network team</w:t>
+      </w:r>
+    </w:p>
+    <w:p>
+      <w:pPr>
+        <w:pStyle w:val="ResumeBullets"/>
+        <w:spacing w:after="40"/>
+      </w:pPr>
+      <w:r>
+        <w:rPr>
+          <w:b/>
+          <w:sz w:val="21"/>
+        </w:rPr>
+        <w:t>Authored the NOCIM-11695 Correction of Errors</w:t>
+      </w:r>
+      <w:r>
+        <w:rPr>
+          <w:sz w:val="21"/>
+        </w:rPr>
+        <w:t xml:space="preserve"> for the April 2026 Azure East US outage and owned the AMP team on-call rotation</w:t>
       </w:r>
     </w:p>
     <w:p>
@@ -1680,43 +1353,92 @@
           <w:color w:val="1F3A68"/>
           <w:sz w:val="23"/>
         </w:rPr>
-        <w:t>AgentOne — Cost / Latency / Reliability-Aware Agent Runtime (2026)</w:t>
-      </w:r>
-    </w:p>
-    <w:p>
-      <w:pPr>
-        <w:pStyle w:val="ResumeBullets"/>
-        <w:spacing w:after="40"/>
-      </w:pPr>
-      <w:r>
-        <w:rPr>
-          <w:sz w:val="21"/>
-        </w:rPr>
-        <w:t>Authored the requirements and architecture for an agent runtime that exposes a stable REST API and CLI, runs a planning/execution loop over repo / API / document tools, and continuously enforces budgets (max tokens, dollars, tool calls, retries, wall-clock)</w:t>
-      </w:r>
-    </w:p>
-    <w:p>
-      <w:pPr>
-        <w:pStyle w:val="ResumeBullets"/>
-        <w:spacing w:after="40"/>
-      </w:pPr>
-      <w:r>
-        <w:rPr>
-          <w:sz w:val="21"/>
-        </w:rPr>
-        <w:t>Designed model routing across local backends (Ollama, vLLM) and a remote gateway, with budget-aware prompting and graceful degradation; specified structured telemetry (per-run cost breakdown, token counts, retry paths, latency distribution) and a benchmark suite of realistic agent tasks (CI triage, dependency-bump, breaking-change summarization)</w:t>
-      </w:r>
-    </w:p>
-    <w:p>
-      <w:pPr>
-        <w:pStyle w:val="ResumeBullets"/>
-        <w:spacing w:after="40"/>
-      </w:pPr>
-      <w:r>
-        <w:rPr>
-          <w:sz w:val="21"/>
-        </w:rPr>
-        <w:t>Defined the system as a set of cooperating engines — API Engine, Management Engine, Extension Engine, LLM Calling Engine, Translator, Prediction Agent, Learning Agent, User Profile, and Credential Store — backed by PostgreSQL ([github.com/mailming/AgentOne](https://github.com/mailming/AgentOne))</w:t>
+        <w:t>Staff Release Engineer / DevOps — Navan (formerly TripActions)</w:t>
+      </w:r>
+    </w:p>
+    <w:p>
+      <w:pPr>
+        <w:spacing w:after="40"/>
+      </w:pPr>
+      <w:r>
+        <w:rPr>
+          <w:b/>
+          <w:i/>
+          <w:sz w:val="20"/>
+        </w:rPr>
+        <w:t>E-Commerce · 01/2022 – 04/2025</w:t>
+      </w:r>
+    </w:p>
+    <w:p>
+      <w:pPr>
+        <w:pStyle w:val="ResumeBullets"/>
+        <w:spacing w:after="40"/>
+      </w:pPr>
+      <w:r>
+        <w:rPr>
+          <w:sz w:val="21"/>
+        </w:rPr>
+        <w:t>Led SOC 2 Type II audit remediation with security, compliance, and engineering teams; hardened build, release, and AWS infrastructure to support Navan's IPO and ongoing compliance</w:t>
+      </w:r>
+    </w:p>
+    <w:p>
+      <w:pPr>
+        <w:pStyle w:val="ResumeBullets"/>
+        <w:spacing w:after="40"/>
+      </w:pPr>
+      <w:r>
+        <w:rPr>
+          <w:sz w:val="21"/>
+        </w:rPr>
+        <w:t>Deployed and integrated HashiCorp Vault for centralized secrets management and SonarCloud for static code analysis and security scanning across CI/CD pipelines</w:t>
+      </w:r>
+    </w:p>
+    <w:p>
+      <w:pPr>
+        <w:pStyle w:val="ResumeBullets"/>
+        <w:spacing w:after="40"/>
+      </w:pPr>
+      <w:r>
+        <w:rPr>
+          <w:sz w:val="21"/>
+        </w:rPr>
+        <w:t>Built and maintained continuous delivery for the company's core web application and data systems on AWS</w:t>
+      </w:r>
+    </w:p>
+    <w:p>
+      <w:pPr>
+        <w:pStyle w:val="ResumeBullets"/>
+        <w:spacing w:after="40"/>
+      </w:pPr>
+      <w:r>
+        <w:rPr>
+          <w:sz w:val="21"/>
+        </w:rPr>
+        <w:t>Owned SCM and release engineering for the engineering organization; optimized release processes across AWS environments</w:t>
+      </w:r>
+    </w:p>
+    <w:p>
+      <w:pPr>
+        <w:pStyle w:val="ResumeBullets"/>
+        <w:spacing w:after="40"/>
+      </w:pPr>
+      <w:r>
+        <w:rPr>
+          <w:sz w:val="21"/>
+        </w:rPr>
+        <w:t>Built mobile CI/CD pipelines with Bitrise to automate App Store and Google Play deployments</w:t>
+      </w:r>
+    </w:p>
+    <w:p>
+      <w:pPr>
+        <w:pStyle w:val="ResumeBullets"/>
+        <w:spacing w:after="40"/>
+      </w:pPr>
+      <w:r>
+        <w:rPr>
+          <w:sz w:val="21"/>
+        </w:rPr>
+        <w:t>Responded rapidly to pipeline failures and production incidents; performed root-cause analysis and drove permanent fixes</w:t>
       </w:r>
     </w:p>
     <w:p>
@@ -1730,44 +1452,92 @@
           <w:color w:val="1F3A68"/>
           <w:sz w:val="23"/>
         </w:rPr>
-        <w:t>LLM-Powered N-Version Programming — Purdue ECE 50874 Lab 2 (2026)</w:t>
-      </w:r>
-    </w:p>
-    <w:p>
-      <w:pPr>
-        <w:pStyle w:val="ResumeBullets"/>
-        <w:spacing w:after="40"/>
-      </w:pPr>
-      <w:r>
-        <w:rPr>
-          <w:sz w:val="21"/>
-        </w:rPr>
-        <w:t>Used three different LLMs to generate three independent implementations of the Avalon tax-code engine in Python, Go, and C++, then ran 10,000 reserved test cases through each version and built a 2-out-of-3 agreement table</w:t>
-      </w:r>
-    </w:p>
-    <w:p>
-      <w:pPr>
-        <w:pStyle w:val="ResumeBullets"/>
-        <w:spacing w:after="40"/>
-      </w:pPr>
-      <w:r>
-        <w:rPr>
-          <w:sz w:val="21"/>
-        </w:rPr>
-        <w:t>Authored the diversity strategy and the analysis of cross-implementation divergence (floating-point representation, rounding rules, threshold handling, FIFO ordering), and wrote up reliability math (</w:t>
-      </w:r>
-      <w:r>
-        <w:rPr>
-          <w:rFonts w:ascii="Consolas" w:hAnsi="Consolas"/>
-          <w:sz w:val="21"/>
-        </w:rPr>
-        <w:t>P(failure) = p²(3 − 2p)</w:t>
-      </w:r>
-      <w:r>
-        <w:rPr>
-          <w:sz w:val="21"/>
-        </w:rPr>
-        <w:t>) for the 2oo3 voter ([github.com/mailming/purdueECE874-Lab2](https://github.com/mailming/purdueECE874-Lab2))</w:t>
+        <w:t>Lead Release Engineer — Turn / Amobee</w:t>
+      </w:r>
+    </w:p>
+    <w:p>
+      <w:pPr>
+        <w:spacing w:after="40"/>
+      </w:pPr>
+      <w:r>
+        <w:rPr>
+          <w:b/>
+          <w:i/>
+          <w:sz w:val="20"/>
+        </w:rPr>
+        <w:t>Ad Technology · 12/2015 – 11/2021</w:t>
+      </w:r>
+    </w:p>
+    <w:p>
+      <w:pPr>
+        <w:pStyle w:val="ResumeBullets"/>
+        <w:spacing w:after="40"/>
+      </w:pPr>
+      <w:r>
+        <w:rPr>
+          <w:sz w:val="21"/>
+        </w:rPr>
+        <w:t>Led a team of 2 release engineers and 5 offshore NOC engineers, scaling release operations for a ~500-person engineering organization</w:t>
+      </w:r>
+    </w:p>
+    <w:p>
+      <w:pPr>
+        <w:pStyle w:val="ResumeBullets"/>
+        <w:spacing w:after="40"/>
+      </w:pPr>
+      <w:r>
+        <w:rPr>
+          <w:sz w:val="21"/>
+        </w:rPr>
+        <w:t>Redesigned and migrated Jenkins to a highly available, scalable architecture—reducing unplanned outages from hours per week to under 5 minutes of planned downtime per month, improving UI response from 12s to 0.5s per page, and saving $500K+/year vs. enterprise CloudBees licensing</w:t>
+      </w:r>
+    </w:p>
+    <w:p>
+      <w:pPr>
+        <w:pStyle w:val="ResumeBullets"/>
+        <w:spacing w:after="40"/>
+      </w:pPr>
+      <w:r>
+        <w:rPr>
+          <w:sz w:val="21"/>
+        </w:rPr>
+        <w:t>Redesigned and migrated Nexus with redundant HA architecture—eliminating unplanned outages post-migration and saving $100K+/year vs. enterprise Sonatype licensing</w:t>
+      </w:r>
+    </w:p>
+    <w:p>
+      <w:pPr>
+        <w:pStyle w:val="ResumeBullets"/>
+        <w:spacing w:after="40"/>
+      </w:pPr>
+      <w:r>
+        <w:rPr>
+          <w:sz w:val="21"/>
+        </w:rPr>
+        <w:t>Managed SCM and application deployments to thousands of production servers worldwide</w:t>
+      </w:r>
+    </w:p>
+    <w:p>
+      <w:pPr>
+        <w:pStyle w:val="ResumeBullets"/>
+        <w:spacing w:after="40"/>
+      </w:pPr>
+      <w:r>
+        <w:rPr>
+          <w:sz w:val="21"/>
+        </w:rPr>
+        <w:t>Built tools and automation to enable rapid, reliable deployment across production environments</w:t>
+      </w:r>
+    </w:p>
+    <w:p>
+      <w:pPr>
+        <w:pStyle w:val="ResumeBullets"/>
+        <w:spacing w:after="40"/>
+      </w:pPr>
+      <w:r>
+        <w:rPr>
+          <w:sz w:val="21"/>
+        </w:rPr>
+        <w:t>Enforced and improved release processes; served in a hands-on Technical Operations role for production systems</w:t>
       </w:r>
     </w:p>
     <w:p>
@@ -1781,19 +1551,68 @@
           <w:color w:val="1F3A68"/>
           <w:sz w:val="23"/>
         </w:rPr>
-        <w:t>Gemini Chat MCP / API Bridge (2025)</w:t>
-      </w:r>
-    </w:p>
-    <w:p>
-      <w:pPr>
-        <w:pStyle w:val="ResumeBullets"/>
-        <w:spacing w:after="40"/>
-      </w:pPr>
-      <w:r>
-        <w:rPr>
-          <w:sz w:val="21"/>
-        </w:rPr>
-        <w:t>Built a Flask + WebSocket + Tampermonkey bridge that exposes the Gemini chat web UI as a Gemini-API-compatible HTTP endpoint and an MCP server, with an example Playwright client and a Python SDK ([github.com/mailming/gemini-chat-userscript](https://github.com/mailming/gemini-chat-userscript))</w:t>
+        <w:t>Sr. Software Engineer — Skytree</w:t>
+      </w:r>
+    </w:p>
+    <w:p>
+      <w:pPr>
+        <w:spacing w:after="40"/>
+      </w:pPr>
+      <w:r>
+        <w:rPr>
+          <w:b/>
+          <w:i/>
+          <w:sz w:val="20"/>
+        </w:rPr>
+        <w:t>Machine Learning · 04/2014 – 11/2015</w:t>
+      </w:r>
+    </w:p>
+    <w:p>
+      <w:pPr>
+        <w:pStyle w:val="ResumeBullets"/>
+        <w:spacing w:after="40"/>
+      </w:pPr>
+      <w:r>
+        <w:rPr>
+          <w:sz w:val="21"/>
+        </w:rPr>
+        <w:t>Designed and implemented end-to-end Continuous Integration and Continuous Delivery systems</w:t>
+      </w:r>
+    </w:p>
+    <w:p>
+      <w:pPr>
+        <w:pStyle w:val="ResumeBullets"/>
+        <w:spacing w:after="40"/>
+      </w:pPr>
+      <w:r>
+        <w:rPr>
+          <w:sz w:val="21"/>
+        </w:rPr>
+        <w:t>Built automation tools to accelerate the development lifecycle and dynamic cluster provisioning on AWS (EC2, S3, EMR)</w:t>
+      </w:r>
+    </w:p>
+    <w:p>
+      <w:pPr>
+        <w:pStyle w:val="ResumeBullets"/>
+        <w:spacing w:after="40"/>
+      </w:pPr>
+      <w:r>
+        <w:rPr>
+          <w:sz w:val="21"/>
+        </w:rPr>
+        <w:t>Designed and implemented a PaaS tool for on-demand environment provisioning</w:t>
+      </w:r>
+    </w:p>
+    <w:p>
+      <w:pPr>
+        <w:pStyle w:val="ResumeBullets"/>
+        <w:spacing w:after="40"/>
+      </w:pPr>
+      <w:r>
+        <w:rPr>
+          <w:sz w:val="21"/>
+        </w:rPr>
+        <w:t>Introduced Scrum and led the development team through agile adoption using Jira</w:t>
       </w:r>
     </w:p>
     <w:p>
@@ -1807,97 +1626,328 @@
           <w:color w:val="1F3A68"/>
           <w:sz w:val="23"/>
         </w:rPr>
-        <w:t>Applied AI / Agent Study</w:t>
-      </w:r>
-    </w:p>
-    <w:p>
-      <w:pPr>
-        <w:pStyle w:val="ResumeBullets"/>
-        <w:spacing w:after="40"/>
-      </w:pPr>
-      <w:r>
-        <w:rPr>
-          <w:sz w:val="21"/>
-        </w:rPr>
-        <w:t xml:space="preserve">Active study and contribution to LLM observability and agent tooling: forks and PRs against </w:t>
-      </w:r>
-      <w:r>
-        <w:rPr>
-          <w:rFonts w:ascii="Consolas" w:hAnsi="Consolas"/>
-          <w:sz w:val="21"/>
-        </w:rPr>
-        <w:t>langfuse</w:t>
-      </w:r>
-      <w:r>
-        <w:rPr>
-          <w:sz w:val="21"/>
-        </w:rPr>
-        <w:t xml:space="preserve">, </w:t>
-      </w:r>
-      <w:r>
-        <w:rPr>
-          <w:rFonts w:ascii="Consolas" w:hAnsi="Consolas"/>
-          <w:sz w:val="21"/>
-        </w:rPr>
-        <w:t>agentops</w:t>
-      </w:r>
-      <w:r>
-        <w:rPr>
-          <w:sz w:val="21"/>
-        </w:rPr>
-        <w:t xml:space="preserve">, Browser-MCP, </w:t>
-      </w:r>
-      <w:r>
-        <w:rPr>
-          <w:rFonts w:ascii="Consolas" w:hAnsi="Consolas"/>
-          <w:sz w:val="21"/>
-        </w:rPr>
-        <w:t>openclaw</w:t>
-      </w:r>
-      <w:r>
-        <w:rPr>
-          <w:sz w:val="21"/>
-        </w:rPr>
-        <w:t xml:space="preserve">, </w:t>
-      </w:r>
-      <w:r>
-        <w:rPr>
-          <w:rFonts w:ascii="Consolas" w:hAnsi="Consolas"/>
-          <w:sz w:val="21"/>
-        </w:rPr>
-        <w:t>minimind</w:t>
-      </w:r>
-      <w:r>
-        <w:rPr>
-          <w:sz w:val="21"/>
-        </w:rPr>
-        <w:t xml:space="preserve"> (training a 26M-parameter GPT from scratch), Anthropic's prompt-engineering tutorial, and multi-agent finance projects (</w:t>
-      </w:r>
-      <w:r>
-        <w:rPr>
-          <w:rFonts w:ascii="Consolas" w:hAnsi="Consolas"/>
-          <w:sz w:val="21"/>
-        </w:rPr>
-        <w:t>TradingAgents</w:t>
-      </w:r>
-      <w:r>
-        <w:rPr>
-          <w:sz w:val="21"/>
-        </w:rPr>
-        <w:t xml:space="preserve">, </w:t>
-      </w:r>
-      <w:r>
-        <w:rPr>
-          <w:rFonts w:ascii="Consolas" w:hAnsi="Consolas"/>
-          <w:sz w:val="21"/>
-        </w:rPr>
-        <w:t>ai-hedge-fund</w:t>
-      </w:r>
-      <w:r>
-        <w:rPr>
-          <w:sz w:val="21"/>
-        </w:rPr>
-        <w:t>)</w:t>
+        <w:t>Sr. Software Engineer — Walmart Labs</w:t>
+      </w:r>
+    </w:p>
+    <w:p>
+      <w:pPr>
+        <w:spacing w:after="40"/>
+      </w:pPr>
+      <w:r>
+        <w:rPr>
+          <w:b/>
+          <w:i/>
+          <w:sz w:val="20"/>
+        </w:rPr>
+        <w:t>E-Commerce · 03/2013 – 04/2014</w:t>
+      </w:r>
+    </w:p>
+    <w:p>
+      <w:pPr>
+        <w:pStyle w:val="ResumeBullets"/>
+        <w:spacing w:after="40"/>
+      </w:pPr>
+      <w:r>
+        <w:rPr>
+          <w:sz w:val="21"/>
+        </w:rPr>
+        <w:t>Built, released, and automated deployments into Dev, QA, and internal production environments</w:t>
+      </w:r>
+    </w:p>
+    <w:p>
+      <w:pPr>
+        <w:pStyle w:val="ResumeBullets"/>
+        <w:spacing w:after="40"/>
+      </w:pPr>
+      <w:r>
+        <w:rPr>
+          <w:sz w:val="21"/>
+        </w:rPr>
+        <w:t>Operated, monitored, and administered multiple production systems and internal tools</w:t>
+      </w:r>
+    </w:p>
+    <w:p>
+      <w:pPr>
+        <w:pStyle w:val="ResumeBullets"/>
+        <w:spacing w:after="40"/>
+      </w:pPr>
+      <w:r>
+        <w:rPr>
+          <w:sz w:val="21"/>
+        </w:rPr>
+        <w:t>Provided build, release, and infrastructure support across engineering teams in an agile environment</w:t>
+      </w:r>
+    </w:p>
+    <w:p>
+      <w:pPr>
+        <w:pStyle w:val="ResumeHeader"/>
+        <w:spacing w:before="160" w:after="0"/>
+      </w:pPr>
+      <w:r>
+        <w:rPr>
+          <w:b/>
+          <w:color w:val="1F3A68"/>
+          <w:sz w:val="23"/>
+        </w:rPr>
+        <w:t>Software Engineer — Macrovision / Rovi</w:t>
+      </w:r>
+    </w:p>
+    <w:p>
+      <w:pPr>
+        <w:spacing w:after="40"/>
+      </w:pPr>
+      <w:r>
+        <w:rPr>
+          <w:b/>
+          <w:i/>
+          <w:sz w:val="20"/>
+        </w:rPr>
+        <w:t>Digital Media · 11/2009 – 02/2013</w:t>
+      </w:r>
+    </w:p>
+    <w:p>
+      <w:pPr>
+        <w:pStyle w:val="ResumeBullets"/>
+        <w:spacing w:after="40"/>
+      </w:pPr>
+      <w:r>
+        <w:rPr>
+          <w:sz w:val="21"/>
+        </w:rPr>
+        <w:t>Defined and maintained configuration management, build/release, and change management across 20+ projects with four domestic and international teams</w:t>
+      </w:r>
+    </w:p>
+    <w:p>
+      <w:pPr>
+        <w:pStyle w:val="ResumeBullets"/>
+        <w:spacing w:after="40"/>
+      </w:pPr>
+      <w:r>
+        <w:rPr>
+          <w:sz w:val="21"/>
+        </w:rPr>
+        <w:t>Led server layout design and deployment procedures for server, web, and mobile applications</w:t>
+      </w:r>
+    </w:p>
+    <w:p>
+      <w:pPr>
+        <w:pStyle w:val="ResumeBullets"/>
+        <w:spacing w:after="40"/>
+      </w:pPr>
+      <w:r>
+        <w:rPr>
+          <w:sz w:val="21"/>
+        </w:rPr>
+        <w:t>Supported Hadoop, MapReduce, and MongoDB system setup and operations</w:t>
+      </w:r>
+    </w:p>
+    <w:p>
+      <w:pPr>
+        <w:pStyle w:val="ResumeBullets"/>
+        <w:spacing w:after="40"/>
+      </w:pPr>
+      <w:r>
+        <w:rPr>
+          <w:sz w:val="21"/>
+        </w:rPr>
+        <w:t>Automated builds (Maven, Ant, xcodebuild, MSBuild) and CI pipelines (TeamCity, Jenkins)</w:t>
+      </w:r>
+    </w:p>
+    <w:p>
+      <w:pPr>
+        <w:pStyle w:val="ResumeBullets"/>
+        <w:spacing w:after="40"/>
+      </w:pPr>
+      <w:r>
+        <w:rPr>
+          <w:sz w:val="21"/>
+        </w:rPr>
+        <w:t>Built a configuration management portal with source archives, build metadata, and automated release notes</w:t>
+      </w:r>
+    </w:p>
+    <w:p>
+      <w:pPr>
+        <w:pStyle w:val="ResumeBullets"/>
+        <w:spacing w:after="40"/>
+      </w:pPr>
+      <w:r>
+        <w:rPr>
+          <w:sz w:val="21"/>
+        </w:rPr>
+        <w:t>Automated Tomcat deployments via Shell scripting; developed Python system tools and RPM-based installations</w:t>
+      </w:r>
+    </w:p>
+    <w:p>
+      <w:pPr>
+        <w:pStyle w:val="ResumeBullets"/>
+        <w:spacing w:after="40"/>
+      </w:pPr>
+      <w:r>
+        <w:rPr>
+          <w:sz w:val="21"/>
+        </w:rPr>
+        <w:t>Established and maintained company Git repositories</w:t>
+      </w:r>
+    </w:p>
+    <w:p>
+      <w:pPr>
+        <w:pStyle w:val="ResumeHeader"/>
+        <w:spacing w:before="160" w:after="0"/>
+      </w:pPr>
+      <w:r>
+        <w:rPr>
+          <w:b/>
+          <w:color w:val="1F3A68"/>
+          <w:sz w:val="23"/>
+        </w:rPr>
+        <w:t>SCM Manager — Helio / Virgin Mobile USA / Sprint</w:t>
+      </w:r>
+    </w:p>
+    <w:p>
+      <w:pPr>
+        <w:spacing w:after="40"/>
+      </w:pPr>
+      <w:r>
+        <w:rPr>
+          <w:b/>
+          <w:i/>
+          <w:sz w:val="20"/>
+        </w:rPr>
+        <w:t>Telecommunications · 02/2007 – 10/2009</w:t>
+      </w:r>
+    </w:p>
+    <w:p>
+      <w:pPr>
+        <w:pStyle w:val="ResumeBullets"/>
+        <w:spacing w:after="40"/>
+      </w:pPr>
+      <w:r>
+        <w:rPr>
+          <w:sz w:val="21"/>
+        </w:rPr>
+        <w:t>Led server layout design and deployment procedures across multiple product lines</w:t>
+      </w:r>
+    </w:p>
+    <w:p>
+      <w:pPr>
+        <w:pStyle w:val="ResumeBullets"/>
+        <w:spacing w:after="40"/>
+      </w:pPr>
+      <w:r>
+        <w:rPr>
+          <w:sz w:val="21"/>
+        </w:rPr>
+        <w:t>Administered a 10+ server Linux dev lab; implemented VM automation via Kickstart</w:t>
+      </w:r>
+    </w:p>
+    <w:p>
+      <w:pPr>
+        <w:pStyle w:val="ResumeBullets"/>
+        <w:spacing w:after="40"/>
+      </w:pPr>
+      <w:r>
+        <w:rPr>
+          <w:sz w:val="21"/>
+        </w:rPr>
+        <w:t>Built CI pipelines with CruiseControl and Hudson/Jenkins; automated JBoss deployments with Shell, Perl, and Python</w:t>
+      </w:r>
+    </w:p>
+    <w:p>
+      <w:pPr>
+        <w:pStyle w:val="ResumeBullets"/>
+        <w:spacing w:after="40"/>
+      </w:pPr>
+      <w:r>
+        <w:rPr>
+          <w:sz w:val="21"/>
+        </w:rPr>
+        <w:t>Evaluated and deployed defect tracking systems (Jira, Trac, Bugzilla, Mantis); implemented Trac and Bugzilla for dev and QA</w:t>
+      </w:r>
+    </w:p>
+    <w:p>
+      <w:pPr>
+        <w:pStyle w:val="ResumeBullets"/>
+        <w:spacing w:after="40"/>
+      </w:pPr>
+      <w:r>
+        <w:rPr>
+          <w:sz w:val="21"/>
+        </w:rPr>
+        <w:t>Created a configuration management portal and continuous deployment workflows using ControlTier</w:t>
+      </w:r>
+    </w:p>
+    <w:p>
+      <w:pPr>
+        <w:pStyle w:val="ResumeHeader"/>
+        <w:spacing w:before="160" w:after="0"/>
+      </w:pPr>
+      <w:r>
+        <w:rPr>
+          <w:b/>
+          <w:color w:val="1F3A68"/>
+          <w:sz w:val="23"/>
+        </w:rPr>
+        <w:t>Software Developer — XLDynamics</w:t>
+      </w:r>
+    </w:p>
+    <w:p>
+      <w:pPr>
+        <w:spacing w:after="40"/>
+      </w:pPr>
+      <w:r>
+        <w:rPr>
+          <w:b/>
+          <w:sz w:val="21"/>
+        </w:rPr>
+        <w:t>01/2005 – 02/2007</w:t>
+      </w:r>
+    </w:p>
+    <w:p>
+      <w:pPr>
+        <w:pStyle w:val="ResumeBullets"/>
+        <w:spacing w:after="40"/>
+      </w:pPr>
+      <w:r>
+        <w:rPr>
+          <w:sz w:val="21"/>
+        </w:rPr>
+        <w:t>Built and configured core development systems across Linux, Unix, and Windows</w:t>
+      </w:r>
+    </w:p>
+    <w:p>
+      <w:pPr>
+        <w:pStyle w:val="ResumeBullets"/>
+        <w:spacing w:after="40"/>
+      </w:pPr>
+      <w:r>
+        <w:rPr>
+          <w:sz w:val="21"/>
+        </w:rPr>
+        <w:t>Created Shell scripts to monitor, test, and install software on Linux servers</w:t>
+      </w:r>
+    </w:p>
+    <w:p>
+      <w:pPr>
+        <w:pStyle w:val="ResumeBullets"/>
+        <w:spacing w:after="40"/>
+      </w:pPr>
+      <w:r>
+        <w:rPr>
+          <w:sz w:val="21"/>
+        </w:rPr>
+        <w:t>Developed C++ XML/SOAP applications and HTML/JavaScript web interfaces</w:t>
+      </w:r>
+    </w:p>
+    <w:p>
+      <w:pPr>
+        <w:pStyle w:val="ResumeBullets"/>
+        <w:spacing w:after="40"/>
+      </w:pPr>
+      <w:r>
+        <w:rPr>
+          <w:sz w:val="21"/>
+        </w:rPr>
+        <w:t>Resolved build and release issues and tracked software changes across multiple projects</w:t>
       </w:r>
     </w:p>
     <w:p>

</xml_diff>

<commit_message>
Regenerate Mingresume.docx from latest resume.md.
Picks up the upstream restructure: Staff Engineer at GEICO, the new
Selected Projects section (OpenClaw Cost-Aware Runtime Plugin and
SmartTuna), and the simplified zero-downtime upgrade bullet.

Co-authored-by: Cursor <cursoragent@cursor.com>
</commit_message>
<xml_diff>
--- a/Mingresume.docx
+++ b/Mingresume.docx
@@ -78,7 +78,46 @@
         <w:rPr>
           <w:sz w:val="21"/>
         </w:rPr>
-        <w:t>Staff-scope platform engineer and AI builder pursuing a Master of Science in Artificial Intelligence at Purdue University, with 20+ years designing CI/CD, package management, and high-availability infrastructure across AWS, Azure, and Kubernetes. Currently Senior Engineer (operating at Staff scope) on GEICO's Artifact Management Platform team — technical lead for the JFrog SaaS POC, the Entra ID authentication design for the internal control plane, and the team's adoption of AI-assisted operations through Model Context Protocol (MCP) servers for JFrog, Slack, and the internal support runbook stack. In parallel, I research and prototype LLM agent systems — including a cost/latency/reliability-aware agent runtime ("AgentOne") and LLM-powered N-version programming — turning DevOps experience into agentic-workflow engineering. Previously Staff Release Engineer at Navan, where I led SOC 2 Type II remediation and platform hardening for IPO readiness.</w:t>
+        <w:t xml:space="preserve">Staff-scope DevOps and platform engineer with 20+ years building CI/CD, artifact management, and high-availability infrastructure across AWS, Azure, and Kubernetes. Currently Staff Engineer on GEICO's Artifact Management Platform — improved Artifactory from ~1 major incident/month to </w:t>
+      </w:r>
+      <w:r>
+        <w:rPr>
+          <w:b/>
+          <w:sz w:val="21"/>
+        </w:rPr>
+        <w:t>four-nines (99.99%) Artifactory availability SLO</w:t>
+      </w:r>
+      <w:r>
+        <w:rPr>
+          <w:sz w:val="21"/>
+        </w:rPr>
+        <w:t xml:space="preserve">, technical lead for enterprise JFrog strategy, Entra ID platform auth, and SOC-grade platform operations. Previously Staff Release Engineer at Navan (SOC 2 Type II / IPO readiness). Track record of multi-million-dollar savings through HA Jenkins/Nexus migrations, global release operations at scale, and cross-org incident leadership. </w:t>
+      </w:r>
+      <w:r>
+        <w:rPr>
+          <w:b/>
+          <w:sz w:val="21"/>
+        </w:rPr>
+        <w:t>Led</w:t>
+      </w:r>
+      <w:r>
+        <w:rPr>
+          <w:sz w:val="21"/>
+        </w:rPr>
+        <w:t xml:space="preserve"> the </w:t>
+      </w:r>
+      <w:r>
+        <w:rPr>
+          <w:b/>
+          <w:sz w:val="21"/>
+        </w:rPr>
+        <w:t>OpenClaw cost-aware runtime plugin</w:t>
+      </w:r>
+      <w:r>
+        <w:rPr>
+          <w:sz w:val="21"/>
+        </w:rPr>
+        <w:t xml:space="preserve"> (originated the approach; primary implementer) for production browser-agent governance. Pursuing MS in Artificial Intelligence at Purdue; founder of [SmartTuna](https://smarttuna.ai/).</w:t>
       </w:r>
     </w:p>
     <w:p>
@@ -100,7 +139,46 @@
           <w:color w:val="1F3A68"/>
           <w:sz w:val="26"/>
         </w:rPr>
-        <w:t>KEY COMPETENCIES</w:t>
+        <w:t>WORK EXPERIENCE</w:t>
+      </w:r>
+    </w:p>
+    <w:p>
+      <w:pPr>
+        <w:pStyle w:val="ResumeHeader"/>
+        <w:spacing w:before="160" w:after="0"/>
+      </w:pPr>
+      <w:r>
+        <w:rPr>
+          <w:b/>
+          <w:color w:val="1F3A68"/>
+          <w:sz w:val="23"/>
+        </w:rPr>
+        <w:t>Staff Engineer — GEICO, Artifact Management Platform (Developer Engineering)</w:t>
+      </w:r>
+    </w:p>
+    <w:p>
+      <w:pPr>
+        <w:spacing w:after="40"/>
+      </w:pPr>
+      <w:r>
+        <w:rPr>
+          <w:b/>
+          <w:i/>
+          <w:sz w:val="20"/>
+        </w:rPr>
+        <w:t>Insurance · 06/2025 – Present</w:t>
+      </w:r>
+    </w:p>
+    <w:p>
+      <w:pPr>
+        <w:spacing w:after="40"/>
+      </w:pPr>
+      <w:r>
+        <w:rPr>
+          <w:i/>
+          <w:sz w:val="21"/>
+        </w:rPr>
+        <w:t>Technical lead and primary architect for the team's largest cross-org initiatives — Identity, SRE, Network, Database Platform, and Developer Engineering.</w:t>
       </w:r>
     </w:p>
     <w:p>
@@ -113,13 +191,26 @@
           <w:b/>
           <w:sz w:val="21"/>
         </w:rPr>
-        <w:t>LLM &amp; AI agent engineering:</w:t>
-      </w:r>
-      <w:r>
-        <w:rPr>
-          <w:sz w:val="21"/>
-        </w:rPr>
-        <w:t xml:space="preserve"> agent runtime design (planning loop, budget enforcement, model routing, graceful degradation), prompt engineering, RAG, multi-LLM evaluation, LLM observability and cost tracking</w:t>
+        <w:t>Artifactory reliability turnaround</w:t>
+      </w:r>
+      <w:r>
+        <w:rPr>
+          <w:sz w:val="21"/>
+        </w:rPr>
+        <w:t xml:space="preserve"> — investigated recurring production failures and drove remediation across platform, config, and operations; improved from </w:t>
+      </w:r>
+      <w:r>
+        <w:rPr>
+          <w:b/>
+          <w:sz w:val="21"/>
+        </w:rPr>
+        <w:t>~1 major incident/month to four-nines (99.99%) Artifactory availability SLO</w:t>
+      </w:r>
+      <w:r>
+        <w:rPr>
+          <w:sz w:val="21"/>
+        </w:rPr>
+        <w:t xml:space="preserve"> completion</w:t>
       </w:r>
     </w:p>
     <w:p>
@@ -132,13 +223,13 @@
           <w:b/>
           <w:sz w:val="21"/>
         </w:rPr>
-        <w:t>Model Context Protocol (MCP):</w:t>
-      </w:r>
-      <w:r>
-        <w:rPr>
-          <w:sz w:val="21"/>
-        </w:rPr>
-        <w:t xml:space="preserve"> authoring and integrating MCP servers (JFrog, Slack, Gemini, browser, internal-support) to give coding agents safe access to enterprise systems</w:t>
+        <w:t>Technical lead, JFrog SaaS POC (Phase 4)</w:t>
+      </w:r>
+      <w:r>
+        <w:rPr>
+          <w:sz w:val="21"/>
+        </w:rPr>
+        <w:t xml:space="preserve"> — validated Python/Java/Go publishing at 5,000 repos / 5,000 parallel artifacts; outcomes drive GEICO's enterprise artifact-management roadmap</w:t>
       </w:r>
     </w:p>
     <w:p>
@@ -151,13 +242,26 @@
           <w:b/>
           <w:sz w:val="21"/>
         </w:rPr>
-        <w:t>Cloud &amp; platform engineering:</w:t>
-      </w:r>
-      <w:r>
-        <w:rPr>
-          <w:sz w:val="21"/>
-        </w:rPr>
-        <w:t xml:space="preserve"> AWS, Azure (AKS, ACR, Azure Firewall, Entra ID), Kubernetes/Helm, Terraform, OpenStack, Docker — multi-region high availability</w:t>
+        <w:t>Architected Entra ID auth</w:t>
+      </w:r>
+      <w:r>
+        <w:rPr>
+          <w:sz w:val="21"/>
+        </w:rPr>
+        <w:t xml:space="preserve"> for </w:t>
+      </w:r>
+      <w:r>
+        <w:rPr>
+          <w:rFonts w:ascii="Consolas" w:hAnsi="Consolas"/>
+          <w:sz w:val="21"/>
+        </w:rPr>
+        <w:t>amp-control-plane</w:t>
+      </w:r>
+      <w:r>
+        <w:rPr>
+          <w:sz w:val="21"/>
+        </w:rPr>
+        <w:t xml:space="preserve"> via cross-team RFC — separated NP/PD access and aligned with corporate SSO / service-to-service standards</w:t>
       </w:r>
     </w:p>
     <w:p>
@@ -170,13 +274,20 @@
           <w:b/>
           <w:sz w:val="21"/>
         </w:rPr>
-        <w:t>Artifact and package management at scale:</w:t>
-      </w:r>
-      <w:r>
-        <w:rPr>
-          <w:sz w:val="21"/>
-        </w:rPr>
-        <w:t xml:space="preserve"> JFrog Artifactory HA, X-Ray, JFrog Catalog, JFrog SaaS, Azure Container Registry, Nexus</w:t>
+        <w:t>Zero-downtime platform upgrades</w:t>
+      </w:r>
+      <w:r>
+        <w:rPr>
+          <w:sz w:val="21"/>
+        </w:rPr>
+        <w:t xml:space="preserve"> — built automation pipeline for rolling Artifactory and X-Ray upgrades across Package Registry and Martech tenants on AKS with </w:t>
+      </w:r>
+      <w:r>
+        <w:rPr>
+          <w:b/>
+          <w:sz w:val="21"/>
+        </w:rPr>
+        <w:t>zero customer impact</w:t>
       </w:r>
     </w:p>
     <w:p>
@@ -189,13 +300,13 @@
           <w:b/>
           <w:sz w:val="21"/>
         </w:rPr>
-        <w:t>CI/CD &amp; developer experience:</w:t>
-      </w:r>
-      <w:r>
-        <w:rPr>
-          <w:sz w:val="21"/>
-        </w:rPr>
-        <w:t xml:space="preserve"> GitHub Actions, Azure DevOps Pipelines, Jenkins, ArgoCD, Bitrise, OIDC pipeline auth, paved-road developer platforms</w:t>
+        <w:t>Production incident leadership</w:t>
+      </w:r>
+      <w:r>
+        <w:rPr>
+          <w:sz w:val="21"/>
+        </w:rPr>
+        <w:t xml:space="preserve"> — packet-level RCA and cross-team fix for Azure Firewall TLS DPI against S3-backed repos; owned CoE for April 2026 Azure East US outage (NOCIM-11695); AMP on-call lead</w:t>
       </w:r>
     </w:p>
     <w:p>
@@ -208,13 +319,40 @@
           <w:b/>
           <w:sz w:val="21"/>
         </w:rPr>
-        <w:t>Security &amp; compliance:</w:t>
-      </w:r>
-      <w:r>
-        <w:rPr>
-          <w:sz w:val="21"/>
-        </w:rPr>
-        <w:t xml:space="preserve"> SOC 2 Type II remediation, secrets management (HashiCorp Vault, Azure Key Vault), static analysis (SonarCloud, X-Ray), Entra ID / OIDC, audit readiness</w:t>
+        <w:t>AI-assisted platform ops</w:t>
+      </w:r>
+      <w:r>
+        <w:rPr>
+          <w:sz w:val="21"/>
+        </w:rPr>
+        <w:t xml:space="preserve"> — introduced MCP-based tooling (JFrog, Slack) and agent skills for support triage, RCA, and runbook workflows</w:t>
+      </w:r>
+    </w:p>
+    <w:p>
+      <w:pPr>
+        <w:pStyle w:val="ResumeHeader"/>
+        <w:spacing w:before="160" w:after="0"/>
+      </w:pPr>
+      <w:r>
+        <w:rPr>
+          <w:b/>
+          <w:color w:val="1F3A68"/>
+          <w:sz w:val="23"/>
+        </w:rPr>
+        <w:t>Staff Release Engineer / DevOps — Navan (formerly TripActions)</w:t>
+      </w:r>
+    </w:p>
+    <w:p>
+      <w:pPr>
+        <w:spacing w:after="40"/>
+      </w:pPr>
+      <w:r>
+        <w:rPr>
+          <w:b/>
+          <w:i/>
+          <w:sz w:val="20"/>
+        </w:rPr>
+        <w:t>E-Commerce · 01/2022 – 04/2025</w:t>
       </w:r>
     </w:p>
     <w:p>
@@ -224,16 +362,701 @@
       </w:pPr>
       <w:r>
         <w:rPr>
-          <w:b/>
-          <w:sz w:val="21"/>
-        </w:rPr>
-        <w:t>Staff-IC scope:</w:t>
-      </w:r>
-      <w:r>
-        <w:rPr>
-          <w:sz w:val="21"/>
-        </w:rPr>
-        <w:t xml:space="preserve"> technical lead for cross-org platform initiatives, RFC and architecture authorship, on-call ownership, mentorship, and cross-functional partnership with security, identity, SRE, network, and data-platform teams</w:t>
+          <w:sz w:val="21"/>
+        </w:rPr>
+        <w:t xml:space="preserve">Led </w:t>
+      </w:r>
+      <w:r>
+        <w:rPr>
+          <w:b/>
+          <w:sz w:val="21"/>
+        </w:rPr>
+        <w:t>SOC 2 Type II</w:t>
+      </w:r>
+      <w:r>
+        <w:rPr>
+          <w:sz w:val="21"/>
+        </w:rPr>
+        <w:t xml:space="preserve"> audit remediation; deployed </w:t>
+      </w:r>
+      <w:r>
+        <w:rPr>
+          <w:b/>
+          <w:sz w:val="21"/>
+        </w:rPr>
+        <w:t>HashiCorp Vault</w:t>
+      </w:r>
+      <w:r>
+        <w:rPr>
+          <w:sz w:val="21"/>
+        </w:rPr>
+        <w:t xml:space="preserve"> and </w:t>
+      </w:r>
+      <w:r>
+        <w:rPr>
+          <w:b/>
+          <w:sz w:val="21"/>
+        </w:rPr>
+        <w:t>SonarCloud</w:t>
+      </w:r>
+      <w:r>
+        <w:rPr>
+          <w:sz w:val="21"/>
+        </w:rPr>
+        <w:t xml:space="preserve"> across CI/CD to support </w:t>
+      </w:r>
+      <w:r>
+        <w:rPr>
+          <w:b/>
+          <w:sz w:val="21"/>
+        </w:rPr>
+        <w:t>IPO readiness</w:t>
+      </w:r>
+    </w:p>
+    <w:p>
+      <w:pPr>
+        <w:pStyle w:val="ResumeBullets"/>
+        <w:spacing w:after="40"/>
+      </w:pPr>
+      <w:r>
+        <w:rPr>
+          <w:sz w:val="21"/>
+        </w:rPr>
+        <w:t>Owned SCM and release engineering for the engineering org; built and maintained continuous delivery for core web and data systems on AWS</w:t>
+      </w:r>
+    </w:p>
+    <w:p>
+      <w:pPr>
+        <w:pStyle w:val="ResumeBullets"/>
+        <w:spacing w:after="40"/>
+      </w:pPr>
+      <w:r>
+        <w:rPr>
+          <w:sz w:val="21"/>
+        </w:rPr>
+        <w:t>Built mobile CI/CD with Bitrise for App Store and Google Play; drove rapid RCA on pipeline and production incidents</w:t>
+      </w:r>
+    </w:p>
+    <w:p>
+      <w:pPr>
+        <w:pStyle w:val="ResumeHeader"/>
+        <w:spacing w:before="160" w:after="0"/>
+      </w:pPr>
+      <w:r>
+        <w:rPr>
+          <w:b/>
+          <w:color w:val="1F3A68"/>
+          <w:sz w:val="23"/>
+        </w:rPr>
+        <w:t>Lead Release Engineer — Turn / Amobee</w:t>
+      </w:r>
+    </w:p>
+    <w:p>
+      <w:pPr>
+        <w:spacing w:after="40"/>
+      </w:pPr>
+      <w:r>
+        <w:rPr>
+          <w:b/>
+          <w:i/>
+          <w:sz w:val="20"/>
+        </w:rPr>
+        <w:t>Ad Technology · 12/2015 – 11/2021</w:t>
+      </w:r>
+    </w:p>
+    <w:p>
+      <w:pPr>
+        <w:pStyle w:val="ResumeBullets"/>
+        <w:spacing w:after="40"/>
+      </w:pPr>
+      <w:r>
+        <w:rPr>
+          <w:sz w:val="21"/>
+        </w:rPr>
+        <w:t xml:space="preserve">Led 2 release engineers + 5 offshore NOC engineers; scaled release ops for ~500-person engineering org deploying to </w:t>
+      </w:r>
+      <w:r>
+        <w:rPr>
+          <w:b/>
+          <w:sz w:val="21"/>
+        </w:rPr>
+        <w:t>thousands of production servers worldwide</w:t>
+      </w:r>
+    </w:p>
+    <w:p>
+      <w:pPr>
+        <w:pStyle w:val="ResumeBullets"/>
+        <w:spacing w:after="40"/>
+      </w:pPr>
+      <w:r>
+        <w:rPr>
+          <w:b/>
+          <w:sz w:val="21"/>
+        </w:rPr>
+        <w:t>Jenkins HA migration</w:t>
+      </w:r>
+      <w:r>
+        <w:rPr>
+          <w:sz w:val="21"/>
+        </w:rPr>
+        <w:t xml:space="preserve"> — cut unplanned outages from hours/week to &lt;5 min planned downtime/month; UI 12s → 0.5s/page; </w:t>
+      </w:r>
+      <w:r>
+        <w:rPr>
+          <w:b/>
+          <w:sz w:val="21"/>
+        </w:rPr>
+        <w:t>saved $500K+/year</w:t>
+      </w:r>
+      <w:r>
+        <w:rPr>
+          <w:sz w:val="21"/>
+        </w:rPr>
+        <w:t xml:space="preserve"> vs. CloudBees enterprise licensing</w:t>
+      </w:r>
+    </w:p>
+    <w:p>
+      <w:pPr>
+        <w:pStyle w:val="ResumeBullets"/>
+        <w:spacing w:after="40"/>
+      </w:pPr>
+      <w:r>
+        <w:rPr>
+          <w:b/>
+          <w:sz w:val="21"/>
+        </w:rPr>
+        <w:t>Nexus HA migration</w:t>
+      </w:r>
+      <w:r>
+        <w:rPr>
+          <w:sz w:val="21"/>
+        </w:rPr>
+        <w:t xml:space="preserve"> — eliminated unplanned outages post-migration; </w:t>
+      </w:r>
+      <w:r>
+        <w:rPr>
+          <w:b/>
+          <w:sz w:val="21"/>
+        </w:rPr>
+        <w:t>saved $100K+/year</w:t>
+      </w:r>
+      <w:r>
+        <w:rPr>
+          <w:sz w:val="21"/>
+        </w:rPr>
+        <w:t xml:space="preserve"> vs. Sonatype enterprise licensing</w:t>
+      </w:r>
+    </w:p>
+    <w:p>
+      <w:pPr>
+        <w:pStyle w:val="ResumeBullets"/>
+        <w:spacing w:after="40"/>
+      </w:pPr>
+      <w:r>
+        <w:rPr>
+          <w:sz w:val="21"/>
+        </w:rPr>
+        <w:t>Built deployment automation and enforced release process; hands-on Technical Operations in production</w:t>
+      </w:r>
+    </w:p>
+    <w:p>
+      <w:pPr>
+        <w:pStyle w:val="ResumeHeader"/>
+        <w:spacing w:before="160" w:after="0"/>
+      </w:pPr>
+      <w:r>
+        <w:rPr>
+          <w:b/>
+          <w:color w:val="1F3A68"/>
+          <w:sz w:val="23"/>
+        </w:rPr>
+        <w:t>Sr. Software Engineer — Skytree</w:t>
+      </w:r>
+    </w:p>
+    <w:p>
+      <w:pPr>
+        <w:spacing w:after="40"/>
+      </w:pPr>
+      <w:r>
+        <w:rPr>
+          <w:b/>
+          <w:i/>
+          <w:sz w:val="20"/>
+        </w:rPr>
+        <w:t>Machine Learning · 04/2014 – 11/2015</w:t>
+      </w:r>
+    </w:p>
+    <w:p>
+      <w:pPr>
+        <w:pStyle w:val="ResumeBullets"/>
+        <w:spacing w:after="40"/>
+      </w:pPr>
+      <w:r>
+        <w:rPr>
+          <w:sz w:val="21"/>
+        </w:rPr>
+        <w:t>Built end-to-end CI/CD systems, AWS dynamic cluster provisioning (EC2, S3, EMR), and a PaaS tool for on-demand environments; led agile adoption</w:t>
+      </w:r>
+    </w:p>
+    <w:p>
+      <w:pPr>
+        <w:pStyle w:val="ResumeHeader"/>
+        <w:spacing w:before="160" w:after="0"/>
+      </w:pPr>
+      <w:r>
+        <w:rPr>
+          <w:b/>
+          <w:color w:val="1F3A68"/>
+          <w:sz w:val="23"/>
+        </w:rPr>
+        <w:t>Sr. Software Engineer — Walmart Labs</w:t>
+      </w:r>
+    </w:p>
+    <w:p>
+      <w:pPr>
+        <w:spacing w:after="40"/>
+      </w:pPr>
+      <w:r>
+        <w:rPr>
+          <w:b/>
+          <w:i/>
+          <w:sz w:val="20"/>
+        </w:rPr>
+        <w:t>E-Commerce · 03/2013 – 04/2014</w:t>
+      </w:r>
+    </w:p>
+    <w:p>
+      <w:pPr>
+        <w:pStyle w:val="ResumeBullets"/>
+        <w:spacing w:after="40"/>
+      </w:pPr>
+      <w:r>
+        <w:rPr>
+          <w:sz w:val="21"/>
+        </w:rPr>
+        <w:t>Automated build/release across Dev, QA, and production; operated and supported multiple production systems for engineering teams</w:t>
+      </w:r>
+    </w:p>
+    <w:p>
+      <w:pPr>
+        <w:pStyle w:val="ResumeHeader"/>
+        <w:spacing w:before="160" w:after="0"/>
+      </w:pPr>
+      <w:r>
+        <w:rPr>
+          <w:b/>
+          <w:color w:val="1F3A68"/>
+          <w:sz w:val="23"/>
+        </w:rPr>
+        <w:t>Software Engineer — Macrovision / Rovi</w:t>
+      </w:r>
+    </w:p>
+    <w:p>
+      <w:pPr>
+        <w:spacing w:after="40"/>
+      </w:pPr>
+      <w:r>
+        <w:rPr>
+          <w:b/>
+          <w:i/>
+          <w:sz w:val="20"/>
+        </w:rPr>
+        <w:t>Digital Media · 11/2009 – 02/2013</w:t>
+      </w:r>
+    </w:p>
+    <w:p>
+      <w:pPr>
+        <w:pStyle w:val="ResumeBullets"/>
+        <w:spacing w:after="40"/>
+      </w:pPr>
+      <w:r>
+        <w:rPr>
+          <w:sz w:val="21"/>
+        </w:rPr>
+        <w:t xml:space="preserve">CM/build/release/change management across </w:t>
+      </w:r>
+      <w:r>
+        <w:rPr>
+          <w:b/>
+          <w:sz w:val="21"/>
+        </w:rPr>
+        <w:t>20+ projects</w:t>
+      </w:r>
+      <w:r>
+        <w:rPr>
+          <w:sz w:val="21"/>
+        </w:rPr>
+        <w:t xml:space="preserve"> and four international teams; Hadoop/MapReduce/MongoDB ops</w:t>
+      </w:r>
+    </w:p>
+    <w:p>
+      <w:pPr>
+        <w:pStyle w:val="ResumeBullets"/>
+        <w:spacing w:after="40"/>
+      </w:pPr>
+      <w:r>
+        <w:rPr>
+          <w:sz w:val="21"/>
+        </w:rPr>
+        <w:t>Automated builds and CI (Maven, Ant, TeamCity, Jenkins); built CM portal with automated release notes; established company Git repos</w:t>
+      </w:r>
+    </w:p>
+    <w:p>
+      <w:pPr>
+        <w:pStyle w:val="ResumeHeader"/>
+        <w:spacing w:before="160" w:after="0"/>
+      </w:pPr>
+      <w:r>
+        <w:rPr>
+          <w:b/>
+          <w:color w:val="1F3A68"/>
+          <w:sz w:val="23"/>
+        </w:rPr>
+        <w:t>SCM Manager — Helio / Virgin Mobile USA / Sprint</w:t>
+      </w:r>
+    </w:p>
+    <w:p>
+      <w:pPr>
+        <w:spacing w:after="40"/>
+      </w:pPr>
+      <w:r>
+        <w:rPr>
+          <w:b/>
+          <w:i/>
+          <w:sz w:val="20"/>
+        </w:rPr>
+        <w:t>Telecommunications · 02/2007 – 10/2009</w:t>
+      </w:r>
+    </w:p>
+    <w:p>
+      <w:pPr>
+        <w:pStyle w:val="ResumeBullets"/>
+        <w:spacing w:after="40"/>
+      </w:pPr>
+      <w:r>
+        <w:rPr>
+          <w:sz w:val="21"/>
+        </w:rPr>
+        <w:t>Server layout, deployment procedures, and CI/CD (CruiseControl, Hudson/Jenkins); VM automation, JBoss deployment automation, defect-tracking rollout</w:t>
+      </w:r>
+    </w:p>
+    <w:p>
+      <w:pPr>
+        <w:pStyle w:val="ResumeHeader"/>
+        <w:spacing w:before="160" w:after="0"/>
+      </w:pPr>
+      <w:r>
+        <w:rPr>
+          <w:b/>
+          <w:color w:val="1F3A68"/>
+          <w:sz w:val="23"/>
+        </w:rPr>
+        <w:t>Software Developer — XLDynamics</w:t>
+      </w:r>
+    </w:p>
+    <w:p>
+      <w:pPr>
+        <w:spacing w:after="40"/>
+      </w:pPr>
+      <w:r>
+        <w:rPr>
+          <w:b/>
+          <w:sz w:val="21"/>
+        </w:rPr>
+        <w:t>01/2005 – 02/2007</w:t>
+      </w:r>
+    </w:p>
+    <w:p>
+      <w:pPr>
+        <w:pStyle w:val="ResumeBullets"/>
+        <w:spacing w:after="40"/>
+      </w:pPr>
+      <w:r>
+        <w:rPr>
+          <w:sz w:val="21"/>
+        </w:rPr>
+        <w:t>Core dev systems on Linux/Unix/Windows; build/release automation, C++ XML/SOAP apps, Shell-based server tooling</w:t>
+      </w:r>
+    </w:p>
+    <w:p>
+      <w:pPr>
+        <w:spacing w:before="40" w:after="40"/>
+        <w:pBdr>
+          <w:bottom w:val="single" w:sz="6" w:space="1" w:color="auto"/>
+        </w:pBdr>
+      </w:pPr>
+    </w:p>
+    <w:p>
+      <w:pPr>
+        <w:pStyle w:val="Heading1"/>
+        <w:spacing w:before="160" w:after="40"/>
+      </w:pPr>
+      <w:r>
+        <w:rPr>
+          <w:b/>
+          <w:color w:val="1F3A68"/>
+          <w:sz w:val="26"/>
+        </w:rPr>
+        <w:t>SELECTED PROJECTS</w:t>
+      </w:r>
+    </w:p>
+    <w:p>
+      <w:pPr>
+        <w:pStyle w:val="ResumeHeader"/>
+        <w:spacing w:before="160" w:after="0"/>
+      </w:pPr>
+      <w:r>
+        <w:rPr>
+          <w:b/>
+          <w:color w:val="1F3A68"/>
+          <w:sz w:val="23"/>
+        </w:rPr>
+        <w:t>OpenClaw Cost-Aware Runtime Plugin — Purdue ECE 50874/59500 Final Project (2026)</w:t>
+      </w:r>
+    </w:p>
+    <w:p>
+      <w:pPr>
+        <w:spacing w:after="40"/>
+      </w:pPr>
+      <w:r>
+        <w:rPr>
+          <w:i/>
+          <w:sz w:val="20"/>
+        </w:rPr>
+        <w:t>*</w:t>
+      </w:r>
+      <w:r>
+        <w:rPr>
+          <w:b/>
+          <w:i/>
+          <w:sz w:val="20"/>
+        </w:rPr>
+        <w:t>Project lead &amp; primary implementer</w:t>
+      </w:r>
+      <w:r>
+        <w:rPr>
+          <w:i/>
+          <w:sz w:val="20"/>
+        </w:rPr>
+        <w:t xml:space="preserve"> · Team 17 · IEEE-style report: "Design and Evaluation of a Cost-Aware Runtime for OpenClaw Browser Agents" · [github.com/mailming/openclaw](https://github.com/mailming/openclaw/tree/feature/llm-insights-manual-pricing)*</w:t>
+      </w:r>
+    </w:p>
+    <w:p>
+      <w:pPr>
+        <w:pStyle w:val="ResumeBullets"/>
+        <w:spacing w:after="40"/>
+      </w:pPr>
+      <w:r>
+        <w:rPr>
+          <w:b/>
+          <w:sz w:val="21"/>
+        </w:rPr>
+        <w:t>Originated the cost-aware runtime concept</w:t>
+      </w:r>
+      <w:r>
+        <w:rPr>
+          <w:sz w:val="21"/>
+        </w:rPr>
+        <w:t xml:space="preserve"> and led end-to-end implementation — a governance layer around [OpenClaw](https://github.com/openclaw-ai/openclaw) browser agents with token/cost/step budgets and post-action policy enforcement, without rewriting core agent logic</w:t>
+      </w:r>
+    </w:p>
+    <w:p>
+      <w:pPr>
+        <w:pStyle w:val="ResumeBullets"/>
+        <w:spacing w:after="40"/>
+      </w:pPr>
+      <w:r>
+        <w:rPr>
+          <w:b/>
+          <w:sz w:val="21"/>
+        </w:rPr>
+        <w:t>Designed and built the LLM Insights gateway plugin</w:t>
+      </w:r>
+      <w:r>
+        <w:rPr>
+          <w:sz w:val="21"/>
+        </w:rPr>
+        <w:t xml:space="preserve"> (primary implementation): rolling cost/latency aggregates, manual model pricing overrides, and usage-to-cost pipeline for multi-model agent operations</w:t>
+      </w:r>
+    </w:p>
+    <w:p>
+      <w:pPr>
+        <w:pStyle w:val="ResumeBullets"/>
+        <w:spacing w:after="40"/>
+      </w:pPr>
+      <w:r>
+        <w:rPr>
+          <w:sz w:val="21"/>
+        </w:rPr>
+        <w:t xml:space="preserve">Integrated </w:t>
+      </w:r>
+      <w:r>
+        <w:rPr>
+          <w:b/>
+          <w:sz w:val="21"/>
+        </w:rPr>
+        <w:t>AgentOps</w:t>
+      </w:r>
+      <w:r>
+        <w:rPr>
+          <w:sz w:val="21"/>
+        </w:rPr>
+        <w:t xml:space="preserve"> (LLM routing, budget state) + </w:t>
+      </w:r>
+      <w:r>
+        <w:rPr>
+          <w:b/>
+          <w:sz w:val="21"/>
+        </w:rPr>
+        <w:t>Langfuse</w:t>
+      </w:r>
+      <w:r>
+        <w:rPr>
+          <w:sz w:val="21"/>
+        </w:rPr>
+        <w:t xml:space="preserve"> (trace telemetry); deployed gateway, Playwright automation, and Telegram control for live demos</w:t>
+      </w:r>
+    </w:p>
+    <w:p>
+      <w:pPr>
+        <w:pStyle w:val="ResumeHeader"/>
+        <w:spacing w:before="160" w:after="0"/>
+      </w:pPr>
+      <w:r>
+        <w:rPr>
+          <w:b/>
+          <w:color w:val="1F3A68"/>
+          <w:sz w:val="23"/>
+        </w:rPr>
+        <w:t>SmartTuna — Founder ([smarttuna.ai](https://smarttuna.ai/))</w:t>
+      </w:r>
+    </w:p>
+    <w:p>
+      <w:pPr>
+        <w:spacing w:after="40"/>
+      </w:pPr>
+      <w:r>
+        <w:rPr>
+          <w:sz w:val="21"/>
+        </w:rPr>
+        <w:t>LangGraph multi-agent stock analysis · Python backend ([smarttuna](https://github.com/mailming/smarttuna)) + Astro UI ([zzsheepTrader](https://github.com/mailming/zzsheepTrader))</w:t>
+      </w:r>
+    </w:p>
+    <w:p>
+      <w:pPr>
+        <w:spacing w:before="40" w:after="40"/>
+        <w:pBdr>
+          <w:bottom w:val="single" w:sz="6" w:space="1" w:color="auto"/>
+        </w:pBdr>
+      </w:pPr>
+    </w:p>
+    <w:p>
+      <w:pPr>
+        <w:pStyle w:val="Heading1"/>
+        <w:spacing w:before="160" w:after="40"/>
+      </w:pPr>
+      <w:r>
+        <w:rPr>
+          <w:b/>
+          <w:color w:val="1F3A68"/>
+          <w:sz w:val="26"/>
+        </w:rPr>
+        <w:t>KEY COMPETENCIES</w:t>
+      </w:r>
+    </w:p>
+    <w:p>
+      <w:pPr>
+        <w:pStyle w:val="ResumeBullets"/>
+        <w:spacing w:after="40"/>
+      </w:pPr>
+      <w:r>
+        <w:rPr>
+          <w:b/>
+          <w:sz w:val="21"/>
+        </w:rPr>
+        <w:t>Platform &amp; DevOps:</w:t>
+      </w:r>
+      <w:r>
+        <w:rPr>
+          <w:sz w:val="21"/>
+        </w:rPr>
+        <w:t xml:space="preserve"> CI/CD, build/release engineering, artifact management (JFrog, Nexus, ACR), Kubernetes/AKS, Terraform, Helm</w:t>
+      </w:r>
+    </w:p>
+    <w:p>
+      <w:pPr>
+        <w:pStyle w:val="ResumeBullets"/>
+        <w:spacing w:after="40"/>
+      </w:pPr>
+      <w:r>
+        <w:rPr>
+          <w:b/>
+          <w:sz w:val="21"/>
+        </w:rPr>
+        <w:t>Cloud:</w:t>
+      </w:r>
+      <w:r>
+        <w:rPr>
+          <w:sz w:val="21"/>
+        </w:rPr>
+        <w:t xml:space="preserve"> AWS, Azure (Entra ID, Azure Firewall, AKS), multi-region HA, Docker</w:t>
+      </w:r>
+    </w:p>
+    <w:p>
+      <w:pPr>
+        <w:pStyle w:val="ResumeBullets"/>
+        <w:spacing w:after="40"/>
+      </w:pPr>
+      <w:r>
+        <w:rPr>
+          <w:b/>
+          <w:sz w:val="21"/>
+        </w:rPr>
+        <w:t>Security &amp; compliance:</w:t>
+      </w:r>
+      <w:r>
+        <w:rPr>
+          <w:sz w:val="21"/>
+        </w:rPr>
+        <w:t xml:space="preserve"> SOC 2 Type II, Vault, Azure Key Vault, SonarCloud, OIDC/RBAC, audit remediation</w:t>
+      </w:r>
+    </w:p>
+    <w:p>
+      <w:pPr>
+        <w:pStyle w:val="ResumeBullets"/>
+        <w:spacing w:after="40"/>
+      </w:pPr>
+      <w:r>
+        <w:rPr>
+          <w:b/>
+          <w:sz w:val="21"/>
+        </w:rPr>
+        <w:t>Leadership:</w:t>
+      </w:r>
+      <w:r>
+        <w:rPr>
+          <w:sz w:val="21"/>
+        </w:rPr>
+        <w:t xml:space="preserve"> Staff-IC technical lead, cross-org RFCs, on-call/incident ownership, global team coordination</w:t>
+      </w:r>
+    </w:p>
+    <w:p>
+      <w:pPr>
+        <w:pStyle w:val="ResumeBullets"/>
+        <w:spacing w:after="40"/>
+      </w:pPr>
+      <w:r>
+        <w:rPr>
+          <w:b/>
+          <w:sz w:val="21"/>
+        </w:rPr>
+        <w:t>AI (supplemental):</w:t>
+      </w:r>
+      <w:r>
+        <w:rPr>
+          <w:sz w:val="21"/>
+        </w:rPr>
+        <w:t xml:space="preserve"> OpenClaw plugin/runtime integration, AgentOps/Langfuse observability, MCP integrations, multi-agent systems</w:t>
       </w:r>
     </w:p>
     <w:p>
@@ -317,7 +1140,7 @@
                 <w:b/>
                 <w:sz w:val="20"/>
               </w:rPr>
-              <w:t>AI / LLMs</w:t>
+              <w:t>Cloud &amp; Platform</w:t>
             </w:r>
           </w:p>
         </w:tc>
@@ -330,7 +1153,7 @@
               <w:rPr>
                 <w:sz w:val="20"/>
               </w:rPr>
-              <w:t>OpenAI GPT, Anthropic Claude, Google Gemini, Ollama, vLLM, local &amp; remote model routing</w:t>
+              <w:t>AWS, Azure (AKS, ACR, Entra ID, Azure Firewall), Kubernetes, Helm, Terraform, Docker, OpenStack</w:t>
             </w:r>
           </w:p>
         </w:tc>
@@ -346,7 +1169,7 @@
                 <w:b/>
                 <w:sz w:val="20"/>
               </w:rPr>
-              <w:t>AI Tooling &amp; Frameworks</w:t>
+              <w:t>CI/CD &amp; Artifacts</w:t>
             </w:r>
           </w:p>
         </w:tc>
@@ -359,7 +1182,7 @@
               <w:rPr>
                 <w:sz w:val="20"/>
               </w:rPr>
-              <w:t>Model Context Protocol (MCP) servers, LangChain, LangGraph, AutoGen, CrewAI, Anthropic Agent Skills, Cursor agents, Langfuse, AgentOps, Playwright agent bridges</w:t>
+              <w:t>Jenkins, GitHub Actions, Azure DevOps, ArgoCD, Bitrise, JFrog Artifactory/X-Ray/SaaS, Nexus, ACR</w:t>
             </w:r>
           </w:p>
         </w:tc>
@@ -375,7 +1198,7 @@
                 <w:b/>
                 <w:sz w:val="20"/>
               </w:rPr>
-              <w:t>AI Engineering Patterns</w:t>
+              <w:t>Languages &amp; Build</w:t>
             </w:r>
           </w:p>
         </w:tc>
@@ -388,7 +1211,7 @@
               <w:rPr>
                 <w:sz w:val="20"/>
               </w:rPr>
-              <w:t>Agent planning/execution loops, budget-aware prompting, N-version LLM programming, RAG, prompt engineering, structured telemetry, deterministic replay</w:t>
+              <w:t>Python, Go, Java, Shell, Groovy, Maven, Gradle, TypeScript, C/C++</w:t>
             </w:r>
           </w:p>
         </w:tc>
@@ -404,7 +1227,7 @@
                 <w:b/>
                 <w:sz w:val="20"/>
               </w:rPr>
-              <w:t>Build &amp; Scripting</w:t>
+              <w:t>Security</w:t>
             </w:r>
           </w:p>
         </w:tc>
@@ -417,7 +1240,7 @@
               <w:rPr>
                 <w:sz w:val="20"/>
               </w:rPr>
-              <w:t>Maven, Gradle, Ant, Python, Shell (Bash), Groovy, Ruby, Xcodebuild, MSBuild</w:t>
+              <w:t>SOC 2 Type II, HashiCorp Vault, Azure Key Vault, SonarCloud, OIDC, Entra ID</w:t>
             </w:r>
           </w:p>
         </w:tc>
@@ -433,7 +1256,7 @@
                 <w:b/>
                 <w:sz w:val="20"/>
               </w:rPr>
-              <w:t>Programming</w:t>
+              <w:t>AI / LLM</w:t>
             </w:r>
           </w:p>
         </w:tc>
@@ -446,210 +1269,7 @@
               <w:rPr>
                 <w:sz w:val="20"/>
               </w:rPr>
-              <w:t>Python, Go, TypeScript, JavaScript, Java, C/C++, SQL, Objective-C, J2EE</w:t>
-            </w:r>
-          </w:p>
-        </w:tc>
-      </w:tr>
-      <w:tr>
-        <w:tc>
-          <w:tcPr>
-            <w:tcW w:type="dxa" w:w="2448"/>
-          </w:tcPr>
-          <w:p>
-            <w:r>
-              <w:rPr>
-                <w:b/>
-                <w:sz w:val="20"/>
-              </w:rPr>
-              <w:t>Cloud &amp; Infrastructure</w:t>
-            </w:r>
-          </w:p>
-        </w:tc>
-        <w:tc>
-          <w:tcPr>
-            <w:tcW w:type="dxa" w:w="7632"/>
-          </w:tcPr>
-          <w:p>
-            <w:r>
-              <w:rPr>
-                <w:sz w:val="20"/>
-              </w:rPr>
-              <w:t>AWS (EC2, S3, EMR, EKS), Azure (AKS, ACR, Azure Firewall, Entra ID), Kubernetes, Helm, Terraform, OpenStack, Docker, Vagrant, Chef</w:t>
-            </w:r>
-          </w:p>
-        </w:tc>
-      </w:tr>
-      <w:tr>
-        <w:tc>
-          <w:tcPr>
-            <w:tcW w:type="dxa" w:w="2448"/>
-          </w:tcPr>
-          <w:p>
-            <w:r>
-              <w:rPr>
-                <w:b/>
-                <w:sz w:val="20"/>
-              </w:rPr>
-              <w:t>CI/CD &amp; DevOps Tools</w:t>
-            </w:r>
-          </w:p>
-        </w:tc>
-        <w:tc>
-          <w:tcPr>
-            <w:tcW w:type="dxa" w:w="7632"/>
-          </w:tcPr>
-          <w:p>
-            <w:r>
-              <w:rPr>
-                <w:sz w:val="20"/>
-              </w:rPr>
-              <w:t>GitHub Actions, Azure DevOps Pipelines, Jenkins, ArgoCD, Bitrise, TeamCity, CruiseControl, Git, Subversion</w:t>
-            </w:r>
-          </w:p>
-        </w:tc>
-      </w:tr>
-      <w:tr>
-        <w:tc>
-          <w:tcPr>
-            <w:tcW w:type="dxa" w:w="2448"/>
-          </w:tcPr>
-          <w:p>
-            <w:r>
-              <w:rPr>
-                <w:b/>
-                <w:sz w:val="20"/>
-              </w:rPr>
-              <w:t>Artifact &amp; Package Management</w:t>
-            </w:r>
-          </w:p>
-        </w:tc>
-        <w:tc>
-          <w:tcPr>
-            <w:tcW w:type="dxa" w:w="7632"/>
-          </w:tcPr>
-          <w:p>
-            <w:r>
-              <w:rPr>
-                <w:sz w:val="20"/>
-              </w:rPr>
-              <w:t>JFrog Artifactory HA, JFrog X-Ray, JFrog Catalog, JFrog SaaS, JFrog CLI, JFrog Workers, Nexus, Azure Container Registry</w:t>
-            </w:r>
-          </w:p>
-        </w:tc>
-      </w:tr>
-      <w:tr>
-        <w:tc>
-          <w:tcPr>
-            <w:tcW w:type="dxa" w:w="2448"/>
-          </w:tcPr>
-          <w:p>
-            <w:r>
-              <w:rPr>
-                <w:b/>
-                <w:sz w:val="20"/>
-              </w:rPr>
-              <w:t>Security &amp; Compliance</w:t>
-            </w:r>
-          </w:p>
-        </w:tc>
-        <w:tc>
-          <w:tcPr>
-            <w:tcW w:type="dxa" w:w="7632"/>
-          </w:tcPr>
-          <w:p>
-            <w:r>
-              <w:rPr>
-                <w:sz w:val="20"/>
-              </w:rPr>
-              <w:t>SOC 2 Type II, HashiCorp Vault, Azure Key Vault, SonarCloud, OIDC, Entra ID/Azure AD, RBAC, secrets rotation, pipeline security scanning</w:t>
-            </w:r>
-          </w:p>
-        </w:tc>
-      </w:tr>
-      <w:tr>
-        <w:tc>
-          <w:tcPr>
-            <w:tcW w:type="dxa" w:w="2448"/>
-          </w:tcPr>
-          <w:p>
-            <w:r>
-              <w:rPr>
-                <w:b/>
-                <w:sz w:val="20"/>
-              </w:rPr>
-              <w:t>Observability &amp; Data</w:t>
-            </w:r>
-          </w:p>
-        </w:tc>
-        <w:tc>
-          <w:tcPr>
-            <w:tcW w:type="dxa" w:w="7632"/>
-          </w:tcPr>
-          <w:p>
-            <w:r>
-              <w:rPr>
-                <w:sz w:val="20"/>
-              </w:rPr>
-              <w:t>Grafana, PostgreSQL, Valkey/Redis, MongoDB, Hadoop, Oracle, MySQL</w:t>
-            </w:r>
-          </w:p>
-        </w:tc>
-      </w:tr>
-      <w:tr>
-        <w:tc>
-          <w:tcPr>
-            <w:tcW w:type="dxa" w:w="2448"/>
-          </w:tcPr>
-          <w:p>
-            <w:r>
-              <w:rPr>
-                <w:b/>
-                <w:sz w:val="20"/>
-              </w:rPr>
-              <w:t>Application Servers</w:t>
-            </w:r>
-          </w:p>
-        </w:tc>
-        <w:tc>
-          <w:tcPr>
-            <w:tcW w:type="dxa" w:w="7632"/>
-          </w:tcPr>
-          <w:p>
-            <w:r>
-              <w:rPr>
-                <w:sz w:val="20"/>
-              </w:rPr>
-              <w:t>Tomcat, Apache, Jetty, JBoss, WebLogic, IIS, NGINX</w:t>
-            </w:r>
-          </w:p>
-        </w:tc>
-      </w:tr>
-      <w:tr>
-        <w:tc>
-          <w:tcPr>
-            <w:tcW w:type="dxa" w:w="2448"/>
-          </w:tcPr>
-          <w:p>
-            <w:r>
-              <w:rPr>
-                <w:b/>
-                <w:sz w:val="20"/>
-              </w:rPr>
-              <w:t>Operating Systems</w:t>
-            </w:r>
-          </w:p>
-        </w:tc>
-        <w:tc>
-          <w:tcPr>
-            <w:tcW w:type="dxa" w:w="7632"/>
-          </w:tcPr>
-          <w:p>
-            <w:r>
-              <w:rPr>
-                <w:sz w:val="20"/>
-              </w:rPr>
-              <w:t>Linux (Ubuntu, Red Hat, CentOS), macOS, Solaris, Windows Server</w:t>
+              <w:t>OpenClaw, AgentOps, Langfuse, MCP servers, LangGraph, Playwright agents, Claude/GPT/Gemini, Ollama, vLLM</w:t>
             </w:r>
           </w:p>
         </w:tc>
@@ -674,519 +1294,7 @@
           <w:color w:val="1F3A68"/>
           <w:sz w:val="26"/>
         </w:rPr>
-        <w:t>AI / AGENT ENGINEERING — SELECTED WORK</w:t>
-      </w:r>
-    </w:p>
-    <w:p>
-      <w:pPr>
-        <w:pStyle w:val="ResumeHeader"/>
-        <w:spacing w:before="160" w:after="0"/>
-      </w:pPr>
-      <w:r>
-        <w:rPr>
-          <w:b/>
-          <w:color w:val="1F3A68"/>
-          <w:sz w:val="23"/>
-        </w:rPr>
-        <w:t>AI-Assisted Platform Operations at GEICO (2025 – Present)</w:t>
-      </w:r>
-    </w:p>
-    <w:p>
-      <w:pPr>
-        <w:pStyle w:val="ResumeBullets"/>
-        <w:spacing w:after="40"/>
-      </w:pPr>
-      <w:r>
-        <w:rPr>
-          <w:sz w:val="21"/>
-        </w:rPr>
-        <w:t xml:space="preserve">Introduced </w:t>
-      </w:r>
-      <w:r>
-        <w:rPr>
-          <w:b/>
-          <w:sz w:val="21"/>
-        </w:rPr>
-        <w:t>MCP-based AI operations</w:t>
-      </w:r>
-      <w:r>
-        <w:rPr>
-          <w:sz w:val="21"/>
-        </w:rPr>
-        <w:t xml:space="preserve"> to the Artifact Management Platform team: integrated the JFrog MCP server and authored Slack MCP guidelines, giving coding agents safe access to registry telemetry, runbooks, and support cases</w:t>
-      </w:r>
-    </w:p>
-    <w:p>
-      <w:pPr>
-        <w:pStyle w:val="ResumeBullets"/>
-        <w:spacing w:after="40"/>
-      </w:pPr>
-      <w:r>
-        <w:rPr>
-          <w:sz w:val="21"/>
-        </w:rPr>
-        <w:t xml:space="preserve">Adopted and extended internal Cursor / Claude </w:t>
-      </w:r>
-      <w:r>
-        <w:rPr>
-          <w:b/>
-          <w:sz w:val="21"/>
-        </w:rPr>
-        <w:t>agent skills</w:t>
-      </w:r>
-      <w:r>
-        <w:rPr>
-          <w:sz w:val="21"/>
-        </w:rPr>
-        <w:t xml:space="preserve"> (</w:t>
-      </w:r>
-      <w:r>
-        <w:rPr>
-          <w:rFonts w:ascii="Consolas" w:hAnsi="Consolas"/>
-          <w:sz w:val="21"/>
-        </w:rPr>
-        <w:t>solve-case</w:t>
-      </w:r>
-      <w:r>
-        <w:rPr>
-          <w:sz w:val="21"/>
-        </w:rPr>
-        <w:t xml:space="preserve">, </w:t>
-      </w:r>
-      <w:r>
-        <w:rPr>
-          <w:rFonts w:ascii="Consolas" w:hAnsi="Consolas"/>
-          <w:sz w:val="21"/>
-        </w:rPr>
-        <w:t>close-case</w:t>
-      </w:r>
-      <w:r>
-        <w:rPr>
-          <w:sz w:val="21"/>
-        </w:rPr>
-        <w:t xml:space="preserve">, </w:t>
-      </w:r>
-      <w:r>
-        <w:rPr>
-          <w:rFonts w:ascii="Consolas" w:hAnsi="Consolas"/>
-          <w:sz w:val="21"/>
-        </w:rPr>
-        <w:t>build-kb</w:t>
-      </w:r>
-      <w:r>
-        <w:rPr>
-          <w:sz w:val="21"/>
-        </w:rPr>
-        <w:t>) for the team's support workflow — measurably shortening triage and improving runbook hygiene</w:t>
-      </w:r>
-    </w:p>
-    <w:p>
-      <w:pPr>
-        <w:pStyle w:val="ResumeBullets"/>
-        <w:spacing w:after="40"/>
-      </w:pPr>
-      <w:r>
-        <w:rPr>
-          <w:sz w:val="21"/>
-        </w:rPr>
-        <w:t xml:space="preserve">Routinely drive </w:t>
-      </w:r>
-      <w:r>
-        <w:rPr>
-          <w:b/>
-          <w:sz w:val="21"/>
-        </w:rPr>
-        <w:t>agent-assisted RCA, RFC, and CoE authoring</w:t>
-      </w:r>
-      <w:r>
-        <w:rPr>
-          <w:sz w:val="21"/>
-        </w:rPr>
-        <w:t xml:space="preserve"> for production incidents (e.g., the Azure Firewall TLS DPI investigation, NOCIM-11695 East US outage write-up)</w:t>
-      </w:r>
-    </w:p>
-    <w:p>
-      <w:pPr>
-        <w:pStyle w:val="ResumeHeader"/>
-        <w:spacing w:before="160" w:after="0"/>
-      </w:pPr>
-      <w:r>
-        <w:rPr>
-          <w:b/>
-          <w:color w:val="1F3A68"/>
-          <w:sz w:val="23"/>
-        </w:rPr>
-        <w:t>Cost-Aware Runtime for OpenClaw Browser Agents — IEEE-style Final Paper, Purdue ECE 50874/59500 (2026)</w:t>
-      </w:r>
-    </w:p>
-    <w:p>
-      <w:pPr>
-        <w:pStyle w:val="ResumeBullets"/>
-        <w:spacing w:after="40"/>
-      </w:pPr>
-      <w:r>
-        <w:rPr>
-          <w:sz w:val="21"/>
-        </w:rPr>
-        <w:t xml:space="preserve">Co-authored </w:t>
-      </w:r>
-      <w:r>
-        <w:rPr>
-          <w:i/>
-          <w:sz w:val="21"/>
-        </w:rPr>
-        <w:t>"Design and Evaluation of a Cost-Aware Runtime for OpenClaw Browser Agents"</w:t>
-      </w:r>
-      <w:r>
-        <w:rPr>
-          <w:sz w:val="21"/>
-        </w:rPr>
-        <w:t xml:space="preserve"> with three Purdue ECE teammates</w:t>
-      </w:r>
-    </w:p>
-    <w:p>
-      <w:pPr>
-        <w:pStyle w:val="ResumeBullets"/>
-        <w:spacing w:after="40"/>
-      </w:pPr>
-      <w:r>
-        <w:rPr>
-          <w:sz w:val="21"/>
-        </w:rPr>
-        <w:t xml:space="preserve">Designed and evaluated a runtime that treats token cost, dollar spend, tool-call count, and wall-clock latency as </w:t>
-      </w:r>
-      <w:r>
-        <w:rPr>
-          <w:b/>
-          <w:sz w:val="21"/>
-        </w:rPr>
-        <w:t>first-class budgets</w:t>
-      </w:r>
-      <w:r>
-        <w:rPr>
-          <w:sz w:val="21"/>
-        </w:rPr>
-        <w:t>, with explicit termination policies (stop-and-summarize, ask-human, best-effort degrade)</w:t>
-      </w:r>
-    </w:p>
-    <w:p>
-      <w:pPr>
-        <w:pStyle w:val="ResumeHeader"/>
-        <w:spacing w:before="160" w:after="0"/>
-      </w:pPr>
-      <w:r>
-        <w:rPr>
-          <w:b/>
-          <w:color w:val="1F3A68"/>
-          <w:sz w:val="23"/>
-        </w:rPr>
-        <w:t>AgentOne — Cost / Latency / Reliability-Aware Agent Runtime (2026)</w:t>
-      </w:r>
-    </w:p>
-    <w:p>
-      <w:pPr>
-        <w:pStyle w:val="ResumeBullets"/>
-        <w:spacing w:after="40"/>
-      </w:pPr>
-      <w:r>
-        <w:rPr>
-          <w:sz w:val="21"/>
-        </w:rPr>
-        <w:t xml:space="preserve">Architected an agent runtime exposing a REST API + CLI, a planning/execution loop over repo / API / document tools, and </w:t>
-      </w:r>
-      <w:r>
-        <w:rPr>
-          <w:b/>
-          <w:sz w:val="21"/>
-        </w:rPr>
-        <w:t>continuous enforcement of token, dollar, tool-call, retry, and wall-clock budgets</w:t>
-      </w:r>
-      <w:r>
-        <w:rPr>
-          <w:sz w:val="21"/>
-        </w:rPr>
-        <w:t xml:space="preserve"> with budget-aware prompting and graceful degradation</w:t>
-      </w:r>
-    </w:p>
-    <w:p>
-      <w:pPr>
-        <w:pStyle w:val="ResumeBullets"/>
-        <w:spacing w:after="40"/>
-      </w:pPr>
-      <w:r>
-        <w:rPr>
-          <w:sz w:val="21"/>
-        </w:rPr>
-        <w:t xml:space="preserve">Routed across </w:t>
-      </w:r>
-      <w:r>
-        <w:rPr>
-          <w:b/>
-          <w:sz w:val="21"/>
-        </w:rPr>
-        <w:t>local backends (Ollama, vLLM) and a remote gateway</w:t>
-      </w:r>
-      <w:r>
-        <w:rPr>
-          <w:sz w:val="21"/>
-        </w:rPr>
-        <w:t>; specified structured per-run telemetry (cost breakdown, token counts, retry paths, latency distribution) and a benchmark suite (CI triage, dependency-bump, breaking-change summarization) — [github.com/mailming/AgentOne](https://github.com/mailming/AgentOne)</w:t>
-      </w:r>
-    </w:p>
-    <w:p>
-      <w:pPr>
-        <w:pStyle w:val="ResumeHeader"/>
-        <w:spacing w:before="160" w:after="0"/>
-      </w:pPr>
-      <w:r>
-        <w:rPr>
-          <w:b/>
-          <w:color w:val="1F3A68"/>
-          <w:sz w:val="23"/>
-        </w:rPr>
-        <w:t>LLM-Powered N-Version Programming — Purdue ECE 50874 Lab 2 (2026)</w:t>
-      </w:r>
-    </w:p>
-    <w:p>
-      <w:pPr>
-        <w:pStyle w:val="ResumeBullets"/>
-        <w:spacing w:after="40"/>
-      </w:pPr>
-      <w:r>
-        <w:rPr>
-          <w:sz w:val="21"/>
-        </w:rPr>
-        <w:t xml:space="preserve">Generated </w:t>
-      </w:r>
-      <w:r>
-        <w:rPr>
-          <w:b/>
-          <w:sz w:val="21"/>
-        </w:rPr>
-        <w:t>three independent implementations (Python, Go, C++)</w:t>
-      </w:r>
-      <w:r>
-        <w:rPr>
-          <w:sz w:val="21"/>
-        </w:rPr>
-        <w:t xml:space="preserve"> of an Avalon tax-code engine using three different LLMs, ran </w:t>
-      </w:r>
-      <w:r>
-        <w:rPr>
-          <w:b/>
-          <w:sz w:val="21"/>
-        </w:rPr>
-        <w:t>10,000 reserved test cases</w:t>
-      </w:r>
-      <w:r>
-        <w:rPr>
-          <w:sz w:val="21"/>
-        </w:rPr>
-        <w:t>, and built a 2-out-of-3 agreement table to quantify LLM-to-LLM divergence</w:t>
-      </w:r>
-    </w:p>
-    <w:p>
-      <w:pPr>
-        <w:pStyle w:val="ResumeBullets"/>
-        <w:spacing w:after="40"/>
-      </w:pPr>
-      <w:r>
-        <w:rPr>
-          <w:sz w:val="21"/>
-        </w:rPr>
-        <w:t xml:space="preserve">Authored the diversity strategy and the analysis of where versions disagreed (floating-point, rounding, threshold, FIFO ordering); wrote up the 2oo3 reliability math </w:t>
-      </w:r>
-      <w:r>
-        <w:rPr>
-          <w:rFonts w:ascii="Consolas" w:hAnsi="Consolas"/>
-          <w:sz w:val="21"/>
-        </w:rPr>
-        <w:t>P(failure) = p²(3 − 2p)</w:t>
-      </w:r>
-      <w:r>
-        <w:rPr>
-          <w:sz w:val="21"/>
-        </w:rPr>
-        <w:t xml:space="preserve"> — [github.com/mailming/purdueECE874-Lab2](https://github.com/mailming/purdueECE874-Lab2)</w:t>
-      </w:r>
-    </w:p>
-    <w:p>
-      <w:pPr>
-        <w:pStyle w:val="ResumeHeader"/>
-        <w:spacing w:before="160" w:after="0"/>
-      </w:pPr>
-      <w:r>
-        <w:rPr>
-          <w:b/>
-          <w:color w:val="1F3A68"/>
-          <w:sz w:val="23"/>
-        </w:rPr>
-        <w:t>Gemini Chat MCP / API Bridge (2025)</w:t>
-      </w:r>
-    </w:p>
-    <w:p>
-      <w:pPr>
-        <w:pStyle w:val="ResumeBullets"/>
-        <w:spacing w:after="40"/>
-      </w:pPr>
-      <w:r>
-        <w:rPr>
-          <w:sz w:val="21"/>
-        </w:rPr>
-        <w:t xml:space="preserve">Built and shipped a </w:t>
-      </w:r>
-      <w:r>
-        <w:rPr>
-          <w:b/>
-          <w:sz w:val="21"/>
-        </w:rPr>
-        <w:t>Flask + WebSocket + Tampermonkey + Playwright</w:t>
-      </w:r>
-      <w:r>
-        <w:rPr>
-          <w:sz w:val="21"/>
-        </w:rPr>
-        <w:t xml:space="preserve"> bridge that exposes the Gemini chat web UI as a Gemini-API-compatible HTTP endpoint and an MCP server, enabling programmatic LLM access without paid API quota — [github.com/mailming/gemini-chat-userscript](https://github.com/mailming/gemini-chat-userscript)</w:t>
-      </w:r>
-    </w:p>
-    <w:p>
-      <w:pPr>
-        <w:pStyle w:val="ResumeHeader"/>
-        <w:spacing w:before="160" w:after="0"/>
-      </w:pPr>
-      <w:r>
-        <w:rPr>
-          <w:b/>
-          <w:color w:val="1F3A68"/>
-          <w:sz w:val="23"/>
-        </w:rPr>
-        <w:t>Applied AI / Agent Study</w:t>
-      </w:r>
-    </w:p>
-    <w:p>
-      <w:pPr>
-        <w:pStyle w:val="ResumeBullets"/>
-        <w:spacing w:after="40"/>
-      </w:pPr>
-      <w:r>
-        <w:rPr>
-          <w:sz w:val="21"/>
-        </w:rPr>
-        <w:t xml:space="preserve">Active contributor and reader across the agent / LLM-ops ecosystem: </w:t>
-      </w:r>
-      <w:r>
-        <w:rPr>
-          <w:rFonts w:ascii="Consolas" w:hAnsi="Consolas"/>
-          <w:sz w:val="21"/>
-        </w:rPr>
-        <w:t>langfuse</w:t>
-      </w:r>
-      <w:r>
-        <w:rPr>
-          <w:sz w:val="21"/>
-        </w:rPr>
-        <w:t xml:space="preserve"> (LLM observability), </w:t>
-      </w:r>
-      <w:r>
-        <w:rPr>
-          <w:rFonts w:ascii="Consolas" w:hAnsi="Consolas"/>
-          <w:sz w:val="21"/>
-        </w:rPr>
-        <w:t>agentops</w:t>
-      </w:r>
-      <w:r>
-        <w:rPr>
-          <w:sz w:val="21"/>
-        </w:rPr>
-        <w:t xml:space="preserve"> (agent monitoring), Browser-MCP, </w:t>
-      </w:r>
-      <w:r>
-        <w:rPr>
-          <w:rFonts w:ascii="Consolas" w:hAnsi="Consolas"/>
-          <w:sz w:val="21"/>
-        </w:rPr>
-        <w:t>openclaw</w:t>
-      </w:r>
-      <w:r>
-        <w:rPr>
-          <w:sz w:val="21"/>
-        </w:rPr>
-        <w:t xml:space="preserve">, </w:t>
-      </w:r>
-      <w:r>
-        <w:rPr>
-          <w:rFonts w:ascii="Consolas" w:hAnsi="Consolas"/>
-          <w:sz w:val="21"/>
-        </w:rPr>
-        <w:t>minimind</w:t>
-      </w:r>
-      <w:r>
-        <w:rPr>
-          <w:sz w:val="21"/>
-        </w:rPr>
-        <w:t xml:space="preserve"> (training a 26M-parameter GPT from scratch), Anthropic's prompt-engineering tutorial, and multi-agent finance projects (</w:t>
-      </w:r>
-      <w:r>
-        <w:rPr>
-          <w:rFonts w:ascii="Consolas" w:hAnsi="Consolas"/>
-          <w:sz w:val="21"/>
-        </w:rPr>
-        <w:t>TradingAgents</w:t>
-      </w:r>
-      <w:r>
-        <w:rPr>
-          <w:sz w:val="21"/>
-        </w:rPr>
-        <w:t xml:space="preserve">, </w:t>
-      </w:r>
-      <w:r>
-        <w:rPr>
-          <w:rFonts w:ascii="Consolas" w:hAnsi="Consolas"/>
-          <w:sz w:val="21"/>
-        </w:rPr>
-        <w:t>ai-hedge-fund</w:t>
-      </w:r>
-      <w:r>
-        <w:rPr>
-          <w:sz w:val="21"/>
-        </w:rPr>
-        <w:t>)</w:t>
-      </w:r>
-    </w:p>
-    <w:p>
-      <w:pPr>
-        <w:spacing w:before="40" w:after="40"/>
-        <w:pBdr>
-          <w:bottom w:val="single" w:sz="6" w:space="1" w:color="auto"/>
-        </w:pBdr>
-      </w:pPr>
-    </w:p>
-    <w:p>
-      <w:pPr>
-        <w:pStyle w:val="Heading1"/>
-        <w:spacing w:before="160" w:after="40"/>
-      </w:pPr>
-      <w:r>
-        <w:rPr>
-          <w:b/>
-          <w:color w:val="1F3A68"/>
-          <w:sz w:val="26"/>
-        </w:rPr>
-        <w:t>WORK EXPERIENCE</w:t>
-      </w:r>
-    </w:p>
-    <w:p>
-      <w:pPr>
-        <w:pStyle w:val="ResumeHeader"/>
-        <w:spacing w:before="160" w:after="0"/>
-      </w:pPr>
-      <w:r>
-        <w:rPr>
-          <w:b/>
-          <w:color w:val="1F3A68"/>
-          <w:sz w:val="23"/>
-        </w:rPr>
-        <w:t>Senior Engineer (Staff-level scope) — GEICO, Artifact Management Platform (Developer Engineering)</w:t>
+        <w:t>EDUCATION</w:t>
       </w:r>
     </w:p>
     <w:p>
@@ -1199,862 +1307,53 @@
           <w:i/>
           <w:sz w:val="20"/>
         </w:rPr>
-        <w:t>Insurance · 06/2025 – Present</w:t>
-      </w:r>
-    </w:p>
-    <w:p>
-      <w:pPr>
-        <w:spacing w:after="40"/>
-      </w:pPr>
-      <w:r>
-        <w:rPr>
-          <w:i/>
-          <w:sz w:val="21"/>
-        </w:rPr>
-        <w:t>Title is Senior Engineer; operate as a Staff-level individual contributor — technical lead and primary architect for the team's biggest cross-org initiatives, partnering with Identity, SRE, Network, Database Platform, and Developer Engineering leadership.</w:t>
-      </w:r>
-    </w:p>
-    <w:p>
-      <w:pPr>
-        <w:pStyle w:val="ResumeBullets"/>
-        <w:spacing w:after="40"/>
-      </w:pPr>
-      <w:r>
-        <w:rPr>
-          <w:b/>
-          <w:sz w:val="21"/>
-        </w:rPr>
-        <w:t>Set the team's AI-operations direction</w:t>
-      </w:r>
-      <w:r>
-        <w:rPr>
-          <w:sz w:val="21"/>
-        </w:rPr>
-        <w:t xml:space="preserve"> — pioneered MCP-based AI-assisted ops on the Artifact Management Platform team and authored the integration guidelines now used across AMP (see </w:t>
-      </w:r>
-      <w:r>
-        <w:rPr>
-          <w:i/>
-          <w:sz w:val="21"/>
-        </w:rPr>
-        <w:t>AI / Agent Engineering — Selected Work</w:t>
-      </w:r>
-      <w:r>
-        <w:rPr>
-          <w:sz w:val="21"/>
-        </w:rPr>
-        <w:t xml:space="preserve"> above)</w:t>
-      </w:r>
-    </w:p>
-    <w:p>
-      <w:pPr>
-        <w:pStyle w:val="ResumeBullets"/>
-        <w:spacing w:after="40"/>
-      </w:pPr>
-      <w:r>
-        <w:rPr>
-          <w:b/>
-          <w:sz w:val="21"/>
-        </w:rPr>
-        <w:t>Technical lead for the JFrog SaaS POC</w:t>
-      </w:r>
-      <w:r>
-        <w:rPr>
-          <w:sz w:val="21"/>
-        </w:rPr>
-        <w:t xml:space="preserve"> through Phase 4 — proved Python/Java/Go publishing patterns and validated scale at 5,000 repos / 5,000 artifacts in parallel; outcomes feed GEICO's enterprise artifact-management roadmap</w:t>
-      </w:r>
-    </w:p>
-    <w:p>
-      <w:pPr>
-        <w:pStyle w:val="ResumeBullets"/>
-        <w:spacing w:after="40"/>
-      </w:pPr>
-      <w:r>
-        <w:rPr>
-          <w:b/>
-          <w:sz w:val="21"/>
-        </w:rPr>
-        <w:t>Architected the Entra ID auth boundary</w:t>
-      </w:r>
-      <w:r>
-        <w:rPr>
-          <w:sz w:val="21"/>
-        </w:rPr>
-        <w:t xml:space="preserve"> for the </w:t>
-      </w:r>
-      <w:r>
-        <w:rPr>
-          <w:rFonts w:ascii="Consolas" w:hAnsi="Consolas"/>
-          <w:sz w:val="21"/>
-        </w:rPr>
-        <w:t>amp-control-plane</w:t>
-      </w:r>
-      <w:r>
-        <w:rPr>
-          <w:sz w:val="21"/>
-        </w:rPr>
-        <w:t xml:space="preserve"> service via cross-team RFC — separated NP/PD access, aligned the platform with corporate SSO and service-to-service auth standards</w:t>
-      </w:r>
-    </w:p>
-    <w:p>
-      <w:pPr>
-        <w:pStyle w:val="ResumeBullets"/>
-        <w:spacing w:after="40"/>
-      </w:pPr>
-      <w:r>
-        <w:rPr>
-          <w:b/>
-          <w:sz w:val="21"/>
-        </w:rPr>
-        <w:t>Delivered zero-customer-impact platform upgrades</w:t>
-      </w:r>
-      <w:r>
-        <w:rPr>
-          <w:sz w:val="21"/>
-        </w:rPr>
-        <w:t xml:space="preserve"> of Artifactory (7.111.12 → 7.146.8) and X-Ray (3.131.20 → 3.143.12) across the Package Registry and Martech tenants on AKS</w:t>
-      </w:r>
-    </w:p>
-    <w:p>
-      <w:pPr>
-        <w:pStyle w:val="ResumeBullets"/>
-        <w:spacing w:after="40"/>
-      </w:pPr>
-      <w:r>
-        <w:rPr>
-          <w:b/>
-          <w:sz w:val="21"/>
-        </w:rPr>
-        <w:t>Drove the root-cause and unblock</w:t>
-      </w:r>
-      <w:r>
-        <w:rPr>
-          <w:sz w:val="21"/>
-        </w:rPr>
-        <w:t xml:space="preserve"> of an Azure Firewall TLS deep-packet-inspection issue against S3-backed remote repositories — produced the packet-level RCA and led the cross-team fix with the network organization</w:t>
-      </w:r>
-    </w:p>
-    <w:p>
-      <w:pPr>
-        <w:pStyle w:val="ResumeBullets"/>
-        <w:spacing w:after="40"/>
-      </w:pPr>
-      <w:r>
-        <w:rPr>
-          <w:b/>
-          <w:sz w:val="21"/>
-        </w:rPr>
-        <w:t>Owned the post-incident Correction of Errors</w:t>
-      </w:r>
-      <w:r>
-        <w:rPr>
-          <w:sz w:val="21"/>
-        </w:rPr>
-        <w:t xml:space="preserve"> for the April 2026 Azure East US outage (NOCIM-11695) and served as the AMP team on-call lead</w:t>
-      </w:r>
-    </w:p>
-    <w:p>
-      <w:pPr>
-        <w:pStyle w:val="ResumeHeader"/>
-        <w:spacing w:before="160" w:after="0"/>
-      </w:pPr>
-      <w:r>
-        <w:rPr>
-          <w:b/>
-          <w:color w:val="1F3A68"/>
-          <w:sz w:val="23"/>
-        </w:rPr>
-        <w:t>Staff Release Engineer / DevOps — Navan (formerly TripActions)</w:t>
-      </w:r>
-    </w:p>
-    <w:p>
-      <w:pPr>
-        <w:spacing w:after="40"/>
-      </w:pPr>
-      <w:r>
-        <w:rPr>
-          <w:b/>
+        <w:t>Purdue University</w:t>
+      </w:r>
+      <w:r>
+        <w:rPr>
           <w:i/>
           <w:sz w:val="20"/>
         </w:rPr>
-        <w:t>E-Commerce · 01/2022 – 04/2025</w:t>
-      </w:r>
-    </w:p>
-    <w:p>
-      <w:pPr>
-        <w:pStyle w:val="ResumeBullets"/>
-        <w:spacing w:after="40"/>
-      </w:pPr>
-      <w:r>
-        <w:rPr>
-          <w:sz w:val="21"/>
-        </w:rPr>
-        <w:t>Led SOC 2 Type II audit remediation with security, compliance, and engineering teams; hardened build, release, and AWS infrastructure to support Navan's IPO and ongoing compliance</w:t>
-      </w:r>
-    </w:p>
-    <w:p>
-      <w:pPr>
-        <w:pStyle w:val="ResumeBullets"/>
-        <w:spacing w:after="40"/>
-      </w:pPr>
-      <w:r>
-        <w:rPr>
-          <w:sz w:val="21"/>
-        </w:rPr>
-        <w:t>Deployed and integrated HashiCorp Vault for centralized secrets management and SonarCloud for static code analysis and security scanning across CI/CD pipelines</w:t>
-      </w:r>
-    </w:p>
-    <w:p>
-      <w:pPr>
-        <w:pStyle w:val="ResumeBullets"/>
-        <w:spacing w:after="40"/>
-      </w:pPr>
-      <w:r>
-        <w:rPr>
-          <w:sz w:val="21"/>
-        </w:rPr>
-        <w:t>Built and maintained continuous delivery for the company's core web application and data systems on AWS</w:t>
-      </w:r>
-    </w:p>
-    <w:p>
-      <w:pPr>
-        <w:pStyle w:val="ResumeBullets"/>
-        <w:spacing w:after="40"/>
-      </w:pPr>
-      <w:r>
-        <w:rPr>
-          <w:sz w:val="21"/>
-        </w:rPr>
-        <w:t>Owned SCM and release engineering for the engineering organization; optimized release processes across AWS environments</w:t>
-      </w:r>
-    </w:p>
-    <w:p>
-      <w:pPr>
-        <w:pStyle w:val="ResumeBullets"/>
-        <w:spacing w:after="40"/>
-      </w:pPr>
-      <w:r>
-        <w:rPr>
-          <w:sz w:val="21"/>
-        </w:rPr>
-        <w:t>Built mobile CI/CD pipelines with Bitrise to automate App Store and Google Play deployments</w:t>
-      </w:r>
-    </w:p>
-    <w:p>
-      <w:pPr>
-        <w:pStyle w:val="ResumeBullets"/>
-        <w:spacing w:after="40"/>
-      </w:pPr>
-      <w:r>
-        <w:rPr>
-          <w:sz w:val="21"/>
-        </w:rPr>
-        <w:t>Responded rapidly to pipeline failures and production incidents; performed root-cause analysis and drove permanent fixes</w:t>
-      </w:r>
-    </w:p>
-    <w:p>
-      <w:pPr>
-        <w:pStyle w:val="ResumeHeader"/>
-        <w:spacing w:before="160" w:after="0"/>
-      </w:pPr>
-      <w:r>
-        <w:rPr>
-          <w:b/>
-          <w:color w:val="1F3A68"/>
-          <w:sz w:val="23"/>
-        </w:rPr>
-        <w:t>Lead Release Engineer — Turn / Amobee</w:t>
-      </w:r>
-    </w:p>
-    <w:p>
-      <w:pPr>
-        <w:spacing w:after="40"/>
-      </w:pPr>
-      <w:r>
-        <w:rPr>
-          <w:b/>
+        <w:t xml:space="preserve"> — MS, Artificial Intelligence </w:t>
+      </w:r>
+      <w:r>
+        <w:rPr>
           <w:i/>
           <w:sz w:val="20"/>
         </w:rPr>
-        <w:t>Ad Technology · 12/2015 – 11/2021</w:t>
-      </w:r>
-    </w:p>
-    <w:p>
-      <w:pPr>
-        <w:pStyle w:val="ResumeBullets"/>
-        <w:spacing w:after="40"/>
-      </w:pPr>
-      <w:r>
-        <w:rPr>
-          <w:sz w:val="21"/>
-        </w:rPr>
-        <w:t>Led a team of 2 release engineers and 5 offshore NOC engineers, scaling release operations for a ~500-person engineering organization</w:t>
-      </w:r>
-    </w:p>
-    <w:p>
-      <w:pPr>
-        <w:pStyle w:val="ResumeBullets"/>
-        <w:spacing w:after="40"/>
-      </w:pPr>
-      <w:r>
-        <w:rPr>
-          <w:sz w:val="21"/>
-        </w:rPr>
-        <w:t>Redesigned and migrated Jenkins to a highly available, scalable architecture—reducing unplanned outages from hours per week to under 5 minutes of planned downtime per month, improving UI response from 12s to 0.5s per page, and saving $500K+/year vs. enterprise CloudBees licensing</w:t>
-      </w:r>
-    </w:p>
-    <w:p>
-      <w:pPr>
-        <w:pStyle w:val="ResumeBullets"/>
-        <w:spacing w:after="40"/>
-      </w:pPr>
-      <w:r>
-        <w:rPr>
-          <w:sz w:val="21"/>
-        </w:rPr>
-        <w:t>Redesigned and migrated Nexus with redundant HA architecture—eliminating unplanned outages post-migration and saving $100K+/year vs. enterprise Sonatype licensing</w:t>
-      </w:r>
-    </w:p>
-    <w:p>
-      <w:pPr>
-        <w:pStyle w:val="ResumeBullets"/>
-        <w:spacing w:after="40"/>
-      </w:pPr>
-      <w:r>
-        <w:rPr>
-          <w:sz w:val="21"/>
-        </w:rPr>
-        <w:t>Managed SCM and application deployments to thousands of production servers worldwide</w:t>
-      </w:r>
-    </w:p>
-    <w:p>
-      <w:pPr>
-        <w:pStyle w:val="ResumeBullets"/>
-        <w:spacing w:after="40"/>
-      </w:pPr>
-      <w:r>
-        <w:rPr>
-          <w:sz w:val="21"/>
-        </w:rPr>
-        <w:t>Built tools and automation to enable rapid, reliable deployment across production environments</w:t>
-      </w:r>
-    </w:p>
-    <w:p>
-      <w:pPr>
-        <w:pStyle w:val="ResumeBullets"/>
-        <w:spacing w:after="40"/>
-      </w:pPr>
-      <w:r>
-        <w:rPr>
-          <w:sz w:val="21"/>
-        </w:rPr>
-        <w:t>Enforced and improved release processes; served in a hands-on Technical Operations role for production systems</w:t>
-      </w:r>
-    </w:p>
-    <w:p>
-      <w:pPr>
-        <w:pStyle w:val="ResumeHeader"/>
-        <w:spacing w:before="160" w:after="0"/>
-      </w:pPr>
-      <w:r>
-        <w:rPr>
-          <w:b/>
-          <w:color w:val="1F3A68"/>
-          <w:sz w:val="23"/>
-        </w:rPr>
-        <w:t>Sr. Software Engineer — Skytree</w:t>
-      </w:r>
-    </w:p>
-    <w:p>
-      <w:pPr>
-        <w:spacing w:after="40"/>
-      </w:pPr>
-      <w:r>
-        <w:rPr>
-          <w:b/>
+        <w:t>(In Progress)</w:t>
+      </w:r>
+      <w:r>
+        <w:rPr>
           <w:i/>
           <w:sz w:val="20"/>
         </w:rPr>
-        <w:t>Machine Learning · 04/2014 – 11/2015</w:t>
-      </w:r>
-    </w:p>
-    <w:p>
-      <w:pPr>
-        <w:pStyle w:val="ResumeBullets"/>
+        <w:t xml:space="preserve"> · ECE 50874/59500: led OpenClaw cost-aware runtime plugin (final project), LLM-augmented software engineering</w:t>
+      </w:r>
+    </w:p>
+    <w:p>
+      <w:pPr>
         <w:spacing w:after="40"/>
       </w:pPr>
       <w:r>
         <w:rPr>
-          <w:sz w:val="21"/>
-        </w:rPr>
-        <w:t>Designed and implemented end-to-end Continuous Integration and Continuous Delivery systems</w:t>
-      </w:r>
-    </w:p>
-    <w:p>
-      <w:pPr>
-        <w:pStyle w:val="ResumeBullets"/>
-        <w:spacing w:after="40"/>
-      </w:pPr>
-      <w:r>
-        <w:rPr>
-          <w:sz w:val="21"/>
-        </w:rPr>
-        <w:t>Built automation tools to accelerate the development lifecycle and dynamic cluster provisioning on AWS (EC2, S3, EMR)</w:t>
-      </w:r>
-    </w:p>
-    <w:p>
-      <w:pPr>
-        <w:pStyle w:val="ResumeBullets"/>
-        <w:spacing w:after="40"/>
-      </w:pPr>
-      <w:r>
-        <w:rPr>
-          <w:sz w:val="21"/>
-        </w:rPr>
-        <w:t>Designed and implemented a PaaS tool for on-demand environment provisioning</w:t>
-      </w:r>
-    </w:p>
-    <w:p>
-      <w:pPr>
-        <w:pStyle w:val="ResumeBullets"/>
-        <w:spacing w:after="40"/>
-      </w:pPr>
-      <w:r>
-        <w:rPr>
-          <w:sz w:val="21"/>
-        </w:rPr>
-        <w:t>Introduced Scrum and led the development team through agile adoption using Jira</w:t>
-      </w:r>
-    </w:p>
-    <w:p>
-      <w:pPr>
-        <w:pStyle w:val="ResumeHeader"/>
-        <w:spacing w:before="160" w:after="0"/>
-      </w:pPr>
-      <w:r>
-        <w:rPr>
-          <w:b/>
-          <w:color w:val="1F3A68"/>
-          <w:sz w:val="23"/>
-        </w:rPr>
-        <w:t>Sr. Software Engineer — Walmart Labs</w:t>
-      </w:r>
-    </w:p>
-    <w:p>
-      <w:pPr>
-        <w:spacing w:after="40"/>
-      </w:pPr>
-      <w:r>
-        <w:rPr>
-          <w:b/>
+          <w:b/>
+          <w:sz w:val="21"/>
+        </w:rPr>
+        <w:t>UCLA</w:t>
+      </w:r>
+      <w:r>
+        <w:rPr>
+          <w:sz w:val="21"/>
+        </w:rPr>
+        <w:t xml:space="preserve"> — BS, Computer Science </w:t>
+      </w:r>
+      <w:r>
+        <w:rPr>
           <w:i/>
-          <w:sz w:val="20"/>
-        </w:rPr>
-        <w:t>E-Commerce · 03/2013 – 04/2014</w:t>
-      </w:r>
-    </w:p>
-    <w:p>
-      <w:pPr>
-        <w:pStyle w:val="ResumeBullets"/>
-        <w:spacing w:after="40"/>
-      </w:pPr>
-      <w:r>
-        <w:rPr>
-          <w:sz w:val="21"/>
-        </w:rPr>
-        <w:t>Built, released, and automated deployments into Dev, QA, and internal production environments</w:t>
-      </w:r>
-    </w:p>
-    <w:p>
-      <w:pPr>
-        <w:pStyle w:val="ResumeBullets"/>
-        <w:spacing w:after="40"/>
-      </w:pPr>
-      <w:r>
-        <w:rPr>
-          <w:sz w:val="21"/>
-        </w:rPr>
-        <w:t>Operated, monitored, and administered multiple production systems and internal tools</w:t>
-      </w:r>
-    </w:p>
-    <w:p>
-      <w:pPr>
-        <w:pStyle w:val="ResumeBullets"/>
-        <w:spacing w:after="40"/>
-      </w:pPr>
-      <w:r>
-        <w:rPr>
-          <w:sz w:val="21"/>
-        </w:rPr>
-        <w:t>Provided build, release, and infrastructure support across engineering teams in an agile environment</w:t>
-      </w:r>
-    </w:p>
-    <w:p>
-      <w:pPr>
-        <w:pStyle w:val="ResumeHeader"/>
-        <w:spacing w:before="160" w:after="0"/>
-      </w:pPr>
-      <w:r>
-        <w:rPr>
-          <w:b/>
-          <w:color w:val="1F3A68"/>
-          <w:sz w:val="23"/>
-        </w:rPr>
-        <w:t>Software Engineer — Macrovision / Rovi</w:t>
-      </w:r>
-    </w:p>
-    <w:p>
-      <w:pPr>
-        <w:spacing w:after="40"/>
-      </w:pPr>
-      <w:r>
-        <w:rPr>
-          <w:b/>
-          <w:i/>
-          <w:sz w:val="20"/>
-        </w:rPr>
-        <w:t>Digital Media · 11/2009 – 02/2013</w:t>
-      </w:r>
-    </w:p>
-    <w:p>
-      <w:pPr>
-        <w:pStyle w:val="ResumeBullets"/>
-        <w:spacing w:after="40"/>
-      </w:pPr>
-      <w:r>
-        <w:rPr>
-          <w:sz w:val="21"/>
-        </w:rPr>
-        <w:t>Defined and maintained configuration management, build/release, and change management across 20+ projects with four domestic and international teams</w:t>
-      </w:r>
-    </w:p>
-    <w:p>
-      <w:pPr>
-        <w:pStyle w:val="ResumeBullets"/>
-        <w:spacing w:after="40"/>
-      </w:pPr>
-      <w:r>
-        <w:rPr>
-          <w:sz w:val="21"/>
-        </w:rPr>
-        <w:t>Led server layout design and deployment procedures for server, web, and mobile applications</w:t>
-      </w:r>
-    </w:p>
-    <w:p>
-      <w:pPr>
-        <w:pStyle w:val="ResumeBullets"/>
-        <w:spacing w:after="40"/>
-      </w:pPr>
-      <w:r>
-        <w:rPr>
-          <w:sz w:val="21"/>
-        </w:rPr>
-        <w:t>Supported Hadoop, MapReduce, and MongoDB system setup and operations</w:t>
-      </w:r>
-    </w:p>
-    <w:p>
-      <w:pPr>
-        <w:pStyle w:val="ResumeBullets"/>
-        <w:spacing w:after="40"/>
-      </w:pPr>
-      <w:r>
-        <w:rPr>
-          <w:sz w:val="21"/>
-        </w:rPr>
-        <w:t>Automated builds (Maven, Ant, xcodebuild, MSBuild) and CI pipelines (TeamCity, Jenkins)</w:t>
-      </w:r>
-    </w:p>
-    <w:p>
-      <w:pPr>
-        <w:pStyle w:val="ResumeBullets"/>
-        <w:spacing w:after="40"/>
-      </w:pPr>
-      <w:r>
-        <w:rPr>
-          <w:sz w:val="21"/>
-        </w:rPr>
-        <w:t>Built a configuration management portal with source archives, build metadata, and automated release notes</w:t>
-      </w:r>
-    </w:p>
-    <w:p>
-      <w:pPr>
-        <w:pStyle w:val="ResumeBullets"/>
-        <w:spacing w:after="40"/>
-      </w:pPr>
-      <w:r>
-        <w:rPr>
-          <w:sz w:val="21"/>
-        </w:rPr>
-        <w:t>Automated Tomcat deployments via Shell scripting; developed Python system tools and RPM-based installations</w:t>
-      </w:r>
-    </w:p>
-    <w:p>
-      <w:pPr>
-        <w:pStyle w:val="ResumeBullets"/>
-        <w:spacing w:after="40"/>
-      </w:pPr>
-      <w:r>
-        <w:rPr>
-          <w:sz w:val="21"/>
-        </w:rPr>
-        <w:t>Established and maintained company Git repositories</w:t>
-      </w:r>
-    </w:p>
-    <w:p>
-      <w:pPr>
-        <w:pStyle w:val="ResumeHeader"/>
-        <w:spacing w:before="160" w:after="0"/>
-      </w:pPr>
-      <w:r>
-        <w:rPr>
-          <w:b/>
-          <w:color w:val="1F3A68"/>
-          <w:sz w:val="23"/>
-        </w:rPr>
-        <w:t>SCM Manager — Helio / Virgin Mobile USA / Sprint</w:t>
-      </w:r>
-    </w:p>
-    <w:p>
-      <w:pPr>
-        <w:spacing w:after="40"/>
-      </w:pPr>
-      <w:r>
-        <w:rPr>
-          <w:b/>
-          <w:i/>
-          <w:sz w:val="20"/>
-        </w:rPr>
-        <w:t>Telecommunications · 02/2007 – 10/2009</w:t>
-      </w:r>
-    </w:p>
-    <w:p>
-      <w:pPr>
-        <w:pStyle w:val="ResumeBullets"/>
-        <w:spacing w:after="40"/>
-      </w:pPr>
-      <w:r>
-        <w:rPr>
-          <w:sz w:val="21"/>
-        </w:rPr>
-        <w:t>Led server layout design and deployment procedures across multiple product lines</w:t>
-      </w:r>
-    </w:p>
-    <w:p>
-      <w:pPr>
-        <w:pStyle w:val="ResumeBullets"/>
-        <w:spacing w:after="40"/>
-      </w:pPr>
-      <w:r>
-        <w:rPr>
-          <w:sz w:val="21"/>
-        </w:rPr>
-        <w:t>Administered a 10+ server Linux dev lab; implemented VM automation via Kickstart</w:t>
-      </w:r>
-    </w:p>
-    <w:p>
-      <w:pPr>
-        <w:pStyle w:val="ResumeBullets"/>
-        <w:spacing w:after="40"/>
-      </w:pPr>
-      <w:r>
-        <w:rPr>
-          <w:sz w:val="21"/>
-        </w:rPr>
-        <w:t>Built CI pipelines with CruiseControl and Hudson/Jenkins; automated JBoss deployments with Shell, Perl, and Python</w:t>
-      </w:r>
-    </w:p>
-    <w:p>
-      <w:pPr>
-        <w:pStyle w:val="ResumeBullets"/>
-        <w:spacing w:after="40"/>
-      </w:pPr>
-      <w:r>
-        <w:rPr>
-          <w:sz w:val="21"/>
-        </w:rPr>
-        <w:t>Evaluated and deployed defect tracking systems (Jira, Trac, Bugzilla, Mantis); implemented Trac and Bugzilla for dev and QA</w:t>
-      </w:r>
-    </w:p>
-    <w:p>
-      <w:pPr>
-        <w:pStyle w:val="ResumeBullets"/>
-        <w:spacing w:after="40"/>
-      </w:pPr>
-      <w:r>
-        <w:rPr>
-          <w:sz w:val="21"/>
-        </w:rPr>
-        <w:t>Created a configuration management portal and continuous deployment workflows using ControlTier</w:t>
-      </w:r>
-    </w:p>
-    <w:p>
-      <w:pPr>
-        <w:pStyle w:val="ResumeHeader"/>
-        <w:spacing w:before="160" w:after="0"/>
-      </w:pPr>
-      <w:r>
-        <w:rPr>
-          <w:b/>
-          <w:color w:val="1F3A68"/>
-          <w:sz w:val="23"/>
-        </w:rPr>
-        <w:t>Software Developer — XLDynamics</w:t>
-      </w:r>
-    </w:p>
-    <w:p>
-      <w:pPr>
-        <w:spacing w:after="40"/>
-      </w:pPr>
-      <w:r>
-        <w:rPr>
-          <w:b/>
-          <w:sz w:val="21"/>
-        </w:rPr>
-        <w:t>01/2005 – 02/2007</w:t>
-      </w:r>
-    </w:p>
-    <w:p>
-      <w:pPr>
-        <w:pStyle w:val="ResumeBullets"/>
-        <w:spacing w:after="40"/>
-      </w:pPr>
-      <w:r>
-        <w:rPr>
-          <w:sz w:val="21"/>
-        </w:rPr>
-        <w:t>Built and configured core development systems across Linux, Unix, and Windows</w:t>
-      </w:r>
-    </w:p>
-    <w:p>
-      <w:pPr>
-        <w:pStyle w:val="ResumeBullets"/>
-        <w:spacing w:after="40"/>
-      </w:pPr>
-      <w:r>
-        <w:rPr>
-          <w:sz w:val="21"/>
-        </w:rPr>
-        <w:t>Created Shell scripts to monitor, test, and install software on Linux servers</w:t>
-      </w:r>
-    </w:p>
-    <w:p>
-      <w:pPr>
-        <w:pStyle w:val="ResumeBullets"/>
-        <w:spacing w:after="40"/>
-      </w:pPr>
-      <w:r>
-        <w:rPr>
-          <w:sz w:val="21"/>
-        </w:rPr>
-        <w:t>Developed C++ XML/SOAP applications and HTML/JavaScript web interfaces</w:t>
-      </w:r>
-    </w:p>
-    <w:p>
-      <w:pPr>
-        <w:pStyle w:val="ResumeBullets"/>
-        <w:spacing w:after="40"/>
-      </w:pPr>
-      <w:r>
-        <w:rPr>
-          <w:sz w:val="21"/>
-        </w:rPr>
-        <w:t>Resolved build and release issues and tracked software changes across multiple projects</w:t>
-      </w:r>
-    </w:p>
-    <w:p>
-      <w:pPr>
-        <w:spacing w:before="40" w:after="40"/>
-        <w:pBdr>
-          <w:bottom w:val="single" w:sz="6" w:space="1" w:color="auto"/>
-        </w:pBdr>
-      </w:pPr>
-    </w:p>
-    <w:p>
-      <w:pPr>
-        <w:pStyle w:val="Heading1"/>
-        <w:spacing w:before="160" w:after="40"/>
-      </w:pPr>
-      <w:r>
-        <w:rPr>
-          <w:b/>
-          <w:color w:val="1F3A68"/>
-          <w:sz w:val="26"/>
-        </w:rPr>
-        <w:t>EDUCATION</w:t>
-      </w:r>
-    </w:p>
-    <w:p>
-      <w:pPr>
-        <w:spacing w:after="40"/>
-      </w:pPr>
-      <w:r>
-        <w:rPr>
-          <w:b/>
-          <w:sz w:val="21"/>
-        </w:rPr>
-        <w:t>Purdue University</w:t>
-      </w:r>
-      <w:r>
-        <w:rPr>
-          <w:sz w:val="21"/>
-        </w:rPr>
-        <w:t xml:space="preserve"> — Master of Science, Artificial Intelligence </w:t>
-      </w:r>
-      <w:r>
-        <w:rPr>
-          <w:i/>
-          <w:sz w:val="21"/>
-        </w:rPr>
-        <w:t>(In Progress)</w:t>
-      </w:r>
-    </w:p>
-    <w:p>
-      <w:pPr>
-        <w:spacing w:after="40"/>
-      </w:pPr>
-      <w:r>
-        <w:rPr>
-          <w:i/>
-          <w:sz w:val="21"/>
-        </w:rPr>
-        <w:t>Coursework:</w:t>
-      </w:r>
-      <w:r>
-        <w:rPr>
-          <w:sz w:val="21"/>
-        </w:rPr>
-        <w:t xml:space="preserve"> ECE 50874/59500 Software Reliability &amp; LLM-Augmented Engineering (Redundant Designs in Software, LLM-Powered N-Version Programming, Cost-Aware Agent Runtimes)</w:t>
-      </w:r>
-    </w:p>
-    <w:p>
-      <w:pPr>
-        <w:spacing w:after="40"/>
-      </w:pPr>
-      <w:r>
-        <w:rPr>
-          <w:b/>
-          <w:sz w:val="21"/>
-        </w:rPr>
-        <w:t>University of California, Los Angeles (UCLA)</w:t>
-      </w:r>
-      <w:r>
-        <w:rPr>
-          <w:sz w:val="21"/>
-        </w:rPr>
-        <w:t xml:space="preserve"> — Bachelor of Science, Computer Science</w:t>
-      </w:r>
-    </w:p>
-    <w:p>
-      <w:pPr>
-        <w:spacing w:after="40"/>
-      </w:pPr>
-      <w:r>
-        <w:rPr>
-          <w:i/>
-          <w:sz w:val="21"/>
-        </w:rPr>
-        <w:t>Minor: Mathematics and Economics</w:t>
+          <w:sz w:val="21"/>
+        </w:rPr>
+        <w:t>(Minor: Mathematics &amp; Economics)</w:t>
       </w:r>
     </w:p>
     <w:p>

</xml_diff>

<commit_message>
Remove GitHub PR and repo links from GEICO bullets.
Co-authored-by: Cursor <cursoragent@cursor.com>
</commit_message>
<xml_diff>
--- a/Mingresume.docx
+++ b/Mingresume.docx
@@ -244,7 +244,7 @@
           <w:color w:val="1F3A68"/>
           <w:sz w:val="23"/>
         </w:rPr>
-        <w:t>Staff Engineer — GEICO, Artifact Management Platform (Developer Engineering)</w:t>
+        <w:t>Senior Engineer — GEICO, Artifact Management Platform (Developer Engineering)</w:t>
       </w:r>
     </w:p>
     <w:p>
@@ -321,7 +321,7 @@
         <w:rPr>
           <w:sz w:val="21"/>
         </w:rPr>
-        <w:t xml:space="preserve"> targeting publication to GEICO's [</w:t>
+        <w:t xml:space="preserve"> targeting publication to GEICO's </w:t>
       </w:r>
       <w:r>
         <w:rPr>
@@ -334,7 +334,7 @@
         <w:rPr>
           <w:sz w:val="21"/>
         </w:rPr>
-        <w:t>](https://github.com/geico-private/developer-agent-hub) marketplace; (d) AI-consumable artifact-auth ADR so any AI agent can onboard external teams without AMP hand-holding</w:t>
+        <w:t xml:space="preserve"> marketplace; (d) AI-consumable artifact-auth ADR so any AI agent can onboard external teams without AMP hand-holding</w:t>
       </w:r>
     </w:p>
     <w:p>
@@ -385,26 +385,26 @@
         <w:rPr>
           <w:sz w:val="21"/>
         </w:rPr>
-        <w:t xml:space="preserve"> — </w:t>
-      </w:r>
-      <w:r>
-        <w:rPr>
-          <w:b/>
-          <w:sz w:val="21"/>
-        </w:rPr>
-        <w:t>shipped Club MCP server config into `amp-control-plane`</w:t>
-      </w:r>
-      <w:r>
-        <w:rPr>
-          <w:sz w:val="21"/>
-        </w:rPr>
-        <w:t xml:space="preserve"> ([AMP #371](https://github.com/geico-private/artifact-management-platform/pull/371)); introduced JFrog/Slack/ADO/GitHub MCP servers and Claude/Cursor agent skills (</w:t>
+        <w:t xml:space="preserve"> — shipped Club MCP server config into </w:t>
       </w:r>
       <w:r>
         <w:rPr>
           <w:rFonts w:ascii="Consolas" w:hAnsi="Consolas"/>
           <w:sz w:val="21"/>
         </w:rPr>
+        <w:t>amp-control-plane</w:t>
+      </w:r>
+      <w:r>
+        <w:rPr>
+          <w:sz w:val="21"/>
+        </w:rPr>
+        <w:t>; introduced JFrog/Slack/ADO/GitHub MCP servers and Claude/Cursor agent skills (</w:t>
+      </w:r>
+      <w:r>
+        <w:rPr>
+          <w:rFonts w:ascii="Consolas" w:hAnsi="Consolas"/>
+          <w:sz w:val="21"/>
+        </w:rPr>
         <w:t>solve-case</w:t>
       </w:r>
       <w:r>
@@ -437,7 +437,7 @@
         <w:rPr>
           <w:sz w:val="21"/>
         </w:rPr>
-        <w:t>) across the team's support, RCA, and runbook workflows; follow-on Club skills + Cursor agent hooks landing via [</w:t>
+        <w:t xml:space="preserve">) across the team's support, RCA, and runbook workflows; follow-on Club skills + Cursor agent hooks landing via </w:t>
       </w:r>
       <w:r>
         <w:rPr>
@@ -445,12 +445,6 @@
           <w:sz w:val="21"/>
         </w:rPr>
         <w:t>club-developer-agent-plugins</w:t>
-      </w:r>
-      <w:r>
-        <w:rPr>
-          <w:sz w:val="21"/>
-        </w:rPr>
-        <w:t>](https://github.com/geico-private/club-developer-agent-plugins)</w:t>
       </w:r>
     </w:p>
     <w:p>
@@ -575,16 +569,16 @@
       </w:r>
       <w:r>
         <w:rPr>
-          <w:b/>
-          <w:sz w:val="21"/>
-        </w:rPr>
-        <w:t>amp-control-plane to ACS prod</w:t>
-      </w:r>
-      <w:r>
-        <w:rPr>
-          <w:sz w:val="21"/>
-        </w:rPr>
-        <w:t xml:space="preserve"> ([AMP #371](https://github.com/geico-private/artifact-management-platform/pull/371))</w:t>
+          <w:rFonts w:ascii="Consolas" w:hAnsi="Consolas"/>
+          <w:sz w:val="21"/>
+        </w:rPr>
+        <w:t>amp-control-plane</w:t>
+      </w:r>
+      <w:r>
+        <w:rPr>
+          <w:sz w:val="21"/>
+        </w:rPr>
+        <w:t xml:space="preserve"> to ACS prod</w:t>
       </w:r>
     </w:p>
     <w:p>

</xml_diff>